<commit_message>
add find files, fix bugs, change default GUI construction
</commit_message>
<xml_diff>
--- a/тесты/проверка зон/фк новое/тест 1.1.docx
+++ b/тесты/проверка зон/фк новое/тест 1.1.docx
@@ -1,6 +1,6 @@
 
 <file path=word/document.xml><?xml version="1.0" encoding="utf-8"?>
-<w:document xmlns:ve="http://schemas.openxmlformats.org/markup-compatibility/2006" xmlns:o="urn:schemas-microsoft-com:office:office" xmlns:r="http://schemas.openxmlformats.org/officeDocument/2006/relationships" xmlns:m="http://schemas.openxmlformats.org/officeDocument/2006/math" xmlns:v="urn:schemas-microsoft-com:vml" xmlns:wp="http://schemas.openxmlformats.org/drawingml/2006/wordprocessingDrawing" xmlns:w10="urn:schemas-microsoft-com:office:word" xmlns:w="http://schemas.openxmlformats.org/wordprocessingml/2006/main" xmlns:wne="http://schemas.microsoft.com/office/word/2006/wordml">
+<w:document xmlns:wpc="http://schemas.microsoft.com/office/word/2010/wordprocessingCanvas" xmlns:cx="http://schemas.microsoft.com/office/drawing/2014/chartex" xmlns:cx1="http://schemas.microsoft.com/office/drawing/2015/9/8/chartex" xmlns:cx2="http://schemas.microsoft.com/office/drawing/2015/10/21/chartex" xmlns:cx3="http://schemas.microsoft.com/office/drawing/2016/5/9/chartex" xmlns:cx4="http://schemas.microsoft.com/office/drawing/2016/5/10/chartex" xmlns:cx5="http://schemas.microsoft.com/office/drawing/2016/5/11/chartex" xmlns:cx6="http://schemas.microsoft.com/office/drawing/2016/5/12/chartex" xmlns:cx7="http://schemas.microsoft.com/office/drawing/2016/5/13/chartex" xmlns:cx8="http://schemas.microsoft.com/office/drawing/2016/5/14/chartex" xmlns:mc="http://schemas.openxmlformats.org/markup-compatibility/2006" xmlns:aink="http://schemas.microsoft.com/office/drawing/2016/ink" xmlns:am3d="http://schemas.microsoft.com/office/drawing/2017/model3d" xmlns:o="urn:schemas-microsoft-com:office:office" xmlns:oel="http://schemas.microsoft.com/office/2019/extlst" xmlns:r="http://schemas.openxmlformats.org/officeDocument/2006/relationships" xmlns:m="http://schemas.openxmlformats.org/officeDocument/2006/math" xmlns:v="urn:schemas-microsoft-com:vml" xmlns:wp14="http://schemas.microsoft.com/office/word/2010/wordprocessingDrawing" xmlns:wp="http://schemas.openxmlformats.org/drawingml/2006/wordprocessingDrawing" xmlns:w10="urn:schemas-microsoft-com:office:word" xmlns:w="http://schemas.openxmlformats.org/wordprocessingml/2006/main" xmlns:w14="http://schemas.microsoft.com/office/word/2010/wordml" xmlns:w15="http://schemas.microsoft.com/office/word/2012/wordml" xmlns:w16cex="http://schemas.microsoft.com/office/word/2018/wordml/cex" xmlns:w16cid="http://schemas.microsoft.com/office/word/2016/wordml/cid" xmlns:w16="http://schemas.microsoft.com/office/word/2018/wordml" xmlns:w16du="http://schemas.microsoft.com/office/word/2023/wordml/word16du" xmlns:w16sdtdh="http://schemas.microsoft.com/office/word/2020/wordml/sdtdatahash" xmlns:w16se="http://schemas.microsoft.com/office/word/2015/wordml/symex" xmlns:wpg="http://schemas.microsoft.com/office/word/2010/wordprocessingGroup" xmlns:wpi="http://schemas.microsoft.com/office/word/2010/wordprocessingInk" xmlns:wne="http://schemas.microsoft.com/office/word/2006/wordml" xmlns:wps="http://schemas.microsoft.com/office/word/2010/wordprocessingShape" mc:Ignorable="w14 w15 w16se w16cid w16 w16cex w16sdtdh w16du wp14">
   <w:body>
     <w:p>
       <w:pPr>
@@ -72,7 +72,7 @@
           <w:insideH w:val="single" w:sz="4" w:space="0" w:color="auto"/>
           <w:insideV w:val="single" w:sz="4" w:space="0" w:color="auto"/>
         </w:tblBorders>
-        <w:tblLook w:val="0000"/>
+        <w:tblLook w:val="0000" w:firstRow="0" w:lastRow="0" w:firstColumn="0" w:lastColumn="0" w:noHBand="0" w:noVBand="0"/>
       </w:tblPr>
       <w:tblGrid>
         <w:gridCol w:w="3770"/>
@@ -331,9 +331,18 @@
           <w:p>
             <w:pPr>
               <w:jc w:val="center"/>
-            </w:pPr>
-            <w:r>
-              <w:t>20</w:t>
+              <w:rPr>
+                <w:lang w:val="en-US"/>
+              </w:rPr>
+            </w:pPr>
+            <w:r>
+              <w:t>2</w:t>
+            </w:r>
+            <w:r>
+              <w:rPr>
+                <w:lang w:val="en-US"/>
+              </w:rPr>
+              <w:t>1</w:t>
             </w:r>
           </w:p>
         </w:tc>
@@ -349,9 +358,18 @@
           <w:p>
             <w:pPr>
               <w:jc w:val="center"/>
-            </w:pPr>
-            <w:r>
-              <w:t>20</w:t>
+              <w:rPr>
+                <w:lang w:val="en-US"/>
+              </w:rPr>
+            </w:pPr>
+            <w:r>
+              <w:t>2</w:t>
+            </w:r>
+            <w:r>
+              <w:rPr>
+                <w:lang w:val="en-US"/>
+              </w:rPr>
+              <w:t>1</w:t>
             </w:r>
           </w:p>
         </w:tc>
@@ -500,7 +518,7 @@
           <w:insideH w:val="single" w:sz="4" w:space="0" w:color="auto"/>
           <w:insideV w:val="single" w:sz="4" w:space="0" w:color="auto"/>
         </w:tblBorders>
-        <w:tblLook w:val="0000"/>
+        <w:tblLook w:val="0000" w:firstRow="0" w:lastRow="0" w:firstColumn="0" w:lastColumn="0" w:noHBand="0" w:noVBand="0"/>
       </w:tblPr>
       <w:tblGrid>
         <w:gridCol w:w="3769"/>
@@ -695,9 +713,18 @@
           <w:p>
             <w:pPr>
               <w:jc w:val="center"/>
-            </w:pPr>
-            <w:r>
-              <w:t>20</w:t>
+              <w:rPr>
+                <w:lang w:val="en-US"/>
+              </w:rPr>
+            </w:pPr>
+            <w:r>
+              <w:t>2</w:t>
+            </w:r>
+            <w:r>
+              <w:rPr>
+                <w:lang w:val="en-US"/>
+              </w:rPr>
+              <w:t>1</w:t>
             </w:r>
           </w:p>
         </w:tc>
@@ -859,7 +886,7 @@
           <w:insideH w:val="single" w:sz="4" w:space="0" w:color="auto"/>
           <w:insideV w:val="single" w:sz="4" w:space="0" w:color="auto"/>
         </w:tblBorders>
-        <w:tblLook w:val="04A0"/>
+        <w:tblLook w:val="04A0" w:firstRow="1" w:lastRow="0" w:firstColumn="1" w:lastColumn="0" w:noHBand="0" w:noVBand="1"/>
       </w:tblPr>
       <w:tblGrid>
         <w:gridCol w:w="416"/>
@@ -1163,33 +1190,25 @@
         <w:tc>
           <w:tcPr>
             <w:tcW w:w="387" w:type="pct"/>
-            <w:shd w:val="clear" w:color="auto" w:fill="FFFF00"/>
-            <w:vAlign w:val="center"/>
-          </w:tcPr>
-          <w:p>
-            <w:pPr>
-              <w:jc w:val="center"/>
-              <w:rPr>
-                <w:b/>
-              </w:rPr>
-            </w:pPr>
-            <w:r>
-              <w:rPr>
-                <w:b/>
-              </w:rPr>
-              <w:t xml:space="preserve"> </w:t>
-            </w:r>
-            <w:r>
-              <w:rPr>
-                <w:b/>
-                <w:highlight w:val="yellow"/>
-              </w:rPr>
-              <w:t>Δ</w:t>
-            </w:r>
-            <w:r>
-              <w:rPr>
-                <w:b/>
-                <w:highlight w:val="yellow"/>
+            <w:shd w:val="clear" w:color="auto" w:fill="auto"/>
+            <w:vAlign w:val="center"/>
+          </w:tcPr>
+          <w:p>
+            <w:pPr>
+              <w:jc w:val="center"/>
+              <w:rPr>
+                <w:b/>
+              </w:rPr>
+            </w:pPr>
+            <w:r>
+              <w:rPr>
+                <w:b/>
+              </w:rPr>
+              <w:t xml:space="preserve"> Δ</w:t>
+            </w:r>
+            <w:r>
+              <w:rPr>
+                <w:b/>
                 <w:vertAlign w:val="superscript"/>
               </w:rPr>
               <w:t>1</w:t>
@@ -1197,7 +1216,6 @@
             <w:r>
               <w:rPr>
                 <w:b/>
-                <w:highlight w:val="yellow"/>
                 <w:vertAlign w:val="subscript"/>
                 <w:lang w:val="en-US"/>
               </w:rPr>
@@ -1431,8 +1449,10 @@
         <w:tc>
           <w:tcPr>
             <w:tcW w:w="1002" w:type="dxa"/>
-            <w:shd w:val="clear" w:color="auto" w:fill="auto"/>
-            <w:vAlign w:val="center"/>
+            <w:shd w:val="clear" w:color="auto" w:fill="FFFF00"/>
+            <w:vAlign w:val="center"/>
+            <w:shd w:fill="FFFF00"/>
+            <w:shd w:fill="FFFF00"/>
           </w:tcPr>
           <w:p>
             <w:pPr>
@@ -1446,8 +1466,10 @@
         <w:tc>
           <w:tcPr>
             <w:tcW w:w="1046" w:type="dxa"/>
-            <w:shd w:val="clear" w:color="auto" w:fill="auto"/>
-            <w:vAlign w:val="center"/>
+            <w:shd w:val="clear" w:color="auto" w:fill="FFFF00"/>
+            <w:vAlign w:val="center"/>
+            <w:shd w:fill="FFFF00"/>
+            <w:shd w:fill="FFFF00"/>
           </w:tcPr>
           <w:p>
             <w:pPr>
@@ -1522,71 +1544,73 @@
           <w:tcPr>
             <w:tcW w:w="785" w:type="dxa"/>
             <w:vMerge w:val="restart"/>
+            <w:shd w:val="clear" w:color="auto" w:fill="auto"/>
+            <w:vAlign w:val="center"/>
+          </w:tcPr>
+          <w:p>
+            <w:pPr>
+              <w:jc w:val="center"/>
+            </w:pPr>
+            <w:r>
+              <w:t>0,5</w:t>
+            </w:r>
+          </w:p>
+        </w:tc>
+        <w:tc>
+          <w:tcPr>
+            <w:tcW w:w="785" w:type="dxa"/>
+            <w:vMerge w:val="restart"/>
+            <w:shd w:val="clear" w:color="auto" w:fill="auto"/>
+            <w:vAlign w:val="center"/>
+          </w:tcPr>
+          <w:p>
+            <w:pPr>
+              <w:jc w:val="center"/>
+            </w:pPr>
+            <w:r>
+              <w:t>13</w:t>
+            </w:r>
+          </w:p>
+        </w:tc>
+        <w:tc>
+          <w:tcPr>
+            <w:tcW w:w="916" w:type="dxa"/>
+            <w:vMerge w:val="restart"/>
+            <w:shd w:val="clear" w:color="auto" w:fill="auto"/>
+            <w:vAlign w:val="center"/>
+          </w:tcPr>
+          <w:p>
+            <w:pPr>
+              <w:jc w:val="center"/>
+            </w:pPr>
+            <w:r>
+              <w:t>9</w:t>
+            </w:r>
+          </w:p>
+        </w:tc>
+        <w:tc>
+          <w:tcPr>
+            <w:tcW w:w="787" w:type="dxa"/>
+            <w:vMerge w:val="restart"/>
+            <w:shd w:val="clear" w:color="auto" w:fill="auto"/>
+            <w:vAlign w:val="center"/>
+          </w:tcPr>
+          <w:p>
+            <w:pPr>
+              <w:jc w:val="center"/>
+            </w:pPr>
+            <w:r>
+              <w:t>5</w:t>
+            </w:r>
+          </w:p>
+        </w:tc>
+        <w:tc>
+          <w:tcPr>
+            <w:tcW w:w="760" w:type="dxa"/>
             <w:shd w:val="clear" w:color="auto" w:fill="FFFF00"/>
             <w:vAlign w:val="center"/>
-          </w:tcPr>
-          <w:p>
-            <w:pPr>
-              <w:jc w:val="center"/>
-            </w:pPr>
-            <w:r>
-              <w:t>0,5</w:t>
-            </w:r>
-          </w:p>
-        </w:tc>
-        <w:tc>
-          <w:tcPr>
-            <w:tcW w:w="785" w:type="dxa"/>
-            <w:vMerge w:val="restart"/>
-            <w:shd w:val="clear" w:color="auto" w:fill="auto"/>
-            <w:vAlign w:val="center"/>
-          </w:tcPr>
-          <w:p>
-            <w:pPr>
-              <w:jc w:val="center"/>
-            </w:pPr>
-            <w:r>
-              <w:t>13</w:t>
-            </w:r>
-          </w:p>
-        </w:tc>
-        <w:tc>
-          <w:tcPr>
-            <w:tcW w:w="916" w:type="dxa"/>
-            <w:vMerge w:val="restart"/>
-            <w:shd w:val="clear" w:color="auto" w:fill="auto"/>
-            <w:vAlign w:val="center"/>
-          </w:tcPr>
-          <w:p>
-            <w:pPr>
-              <w:jc w:val="center"/>
-            </w:pPr>
-            <w:r>
-              <w:t>9</w:t>
-            </w:r>
-          </w:p>
-        </w:tc>
-        <w:tc>
-          <w:tcPr>
-            <w:tcW w:w="787" w:type="dxa"/>
-            <w:vMerge w:val="restart"/>
-            <w:shd w:val="clear" w:color="auto" w:fill="auto"/>
-            <w:vAlign w:val="center"/>
-          </w:tcPr>
-          <w:p>
-            <w:pPr>
-              <w:jc w:val="center"/>
-            </w:pPr>
-            <w:r>
-              <w:t>5</w:t>
-            </w:r>
-          </w:p>
-        </w:tc>
-        <w:tc>
-          <w:tcPr>
-            <w:tcW w:w="760" w:type="dxa"/>
-            <w:shd w:val="clear" w:color="auto" w:fill="auto"/>
-            <w:vAlign w:val="center"/>
+            <w:shd w:fill="FFFF00"/>
+            <w:shd w:fill="FFFF00"/>
           </w:tcPr>
           <w:p>
             <w:pPr>
@@ -1617,8 +1641,10 @@
         <w:tc>
           <w:tcPr>
             <w:tcW w:w="1002" w:type="dxa"/>
-            <w:shd w:val="clear" w:color="auto" w:fill="auto"/>
-            <w:vAlign w:val="center"/>
+            <w:shd w:val="clear" w:color="auto" w:fill="FFFF00"/>
+            <w:vAlign w:val="center"/>
+            <w:shd w:fill="FFFF00"/>
+            <w:shd w:fill="FFFF00"/>
           </w:tcPr>
           <w:p>
             <w:pPr>
@@ -1632,8 +1658,10 @@
         <w:tc>
           <w:tcPr>
             <w:tcW w:w="1046" w:type="dxa"/>
-            <w:shd w:val="clear" w:color="auto" w:fill="auto"/>
-            <w:vAlign w:val="center"/>
+            <w:shd w:val="clear" w:color="auto" w:fill="FFFF00"/>
+            <w:vAlign w:val="center"/>
+            <w:shd w:fill="FFFF00"/>
+            <w:shd w:fill="FFFF00"/>
           </w:tcPr>
           <w:p>
             <w:pPr>
@@ -1708,71 +1736,73 @@
           <w:tcPr>
             <w:tcW w:w="785" w:type="dxa"/>
             <w:vMerge w:val="restart"/>
+            <w:shd w:val="clear" w:color="auto" w:fill="auto"/>
+            <w:vAlign w:val="center"/>
+          </w:tcPr>
+          <w:p>
+            <w:pPr>
+              <w:jc w:val="center"/>
+            </w:pPr>
+            <w:r>
+              <w:t>0,5</w:t>
+            </w:r>
+          </w:p>
+        </w:tc>
+        <w:tc>
+          <w:tcPr>
+            <w:tcW w:w="785" w:type="dxa"/>
+            <w:vMerge w:val="restart"/>
+            <w:shd w:val="clear" w:color="auto" w:fill="auto"/>
+            <w:vAlign w:val="center"/>
+          </w:tcPr>
+          <w:p>
+            <w:pPr>
+              <w:jc w:val="center"/>
+            </w:pPr>
+            <w:r>
+              <w:t>15</w:t>
+            </w:r>
+          </w:p>
+        </w:tc>
+        <w:tc>
+          <w:tcPr>
+            <w:tcW w:w="916" w:type="dxa"/>
+            <w:vMerge w:val="restart"/>
+            <w:shd w:val="clear" w:color="auto" w:fill="auto"/>
+            <w:vAlign w:val="center"/>
+          </w:tcPr>
+          <w:p>
+            <w:pPr>
+              <w:jc w:val="center"/>
+            </w:pPr>
+            <w:r>
+              <w:t>9</w:t>
+            </w:r>
+          </w:p>
+        </w:tc>
+        <w:tc>
+          <w:tcPr>
+            <w:tcW w:w="787" w:type="dxa"/>
+            <w:vMerge w:val="restart"/>
+            <w:shd w:val="clear" w:color="auto" w:fill="auto"/>
+            <w:vAlign w:val="center"/>
+          </w:tcPr>
+          <w:p>
+            <w:pPr>
+              <w:jc w:val="center"/>
+            </w:pPr>
+            <w:r>
+              <w:t>5</w:t>
+            </w:r>
+          </w:p>
+        </w:tc>
+        <w:tc>
+          <w:tcPr>
+            <w:tcW w:w="760" w:type="dxa"/>
             <w:shd w:val="clear" w:color="auto" w:fill="FFFF00"/>
             <w:vAlign w:val="center"/>
-          </w:tcPr>
-          <w:p>
-            <w:pPr>
-              <w:jc w:val="center"/>
-            </w:pPr>
-            <w:r>
-              <w:t>0,5</w:t>
-            </w:r>
-          </w:p>
-        </w:tc>
-        <w:tc>
-          <w:tcPr>
-            <w:tcW w:w="785" w:type="dxa"/>
-            <w:vMerge w:val="restart"/>
-            <w:shd w:val="clear" w:color="auto" w:fill="auto"/>
-            <w:vAlign w:val="center"/>
-          </w:tcPr>
-          <w:p>
-            <w:pPr>
-              <w:jc w:val="center"/>
-            </w:pPr>
-            <w:r>
-              <w:t>15</w:t>
-            </w:r>
-          </w:p>
-        </w:tc>
-        <w:tc>
-          <w:tcPr>
-            <w:tcW w:w="916" w:type="dxa"/>
-            <w:vMerge w:val="restart"/>
-            <w:shd w:val="clear" w:color="auto" w:fill="auto"/>
-            <w:vAlign w:val="center"/>
-          </w:tcPr>
-          <w:p>
-            <w:pPr>
-              <w:jc w:val="center"/>
-            </w:pPr>
-            <w:r>
-              <w:t>9</w:t>
-            </w:r>
-          </w:p>
-        </w:tc>
-        <w:tc>
-          <w:tcPr>
-            <w:tcW w:w="787" w:type="dxa"/>
-            <w:vMerge w:val="restart"/>
-            <w:shd w:val="clear" w:color="auto" w:fill="auto"/>
-            <w:vAlign w:val="center"/>
-          </w:tcPr>
-          <w:p>
-            <w:pPr>
-              <w:jc w:val="center"/>
-            </w:pPr>
-            <w:r>
-              <w:t>5</w:t>
-            </w:r>
-          </w:p>
-        </w:tc>
-        <w:tc>
-          <w:tcPr>
-            <w:tcW w:w="760" w:type="dxa"/>
-            <w:shd w:val="clear" w:color="auto" w:fill="auto"/>
-            <w:vAlign w:val="center"/>
+            <w:shd w:fill="FFFF00"/>
+            <w:shd w:fill="FFFF00"/>
           </w:tcPr>
           <w:p>
             <w:pPr>
@@ -1990,7 +2020,7 @@
           <w:tcPr>
             <w:tcW w:w="785" w:type="dxa"/>
             <w:vMerge w:val="restart"/>
-            <w:shd w:val="clear" w:color="auto" w:fill="FFFF00"/>
+            <w:shd w:val="clear" w:color="auto" w:fill="auto"/>
             <w:vAlign w:val="center"/>
           </w:tcPr>
           <w:p>
@@ -2176,7 +2206,7 @@
           <w:tcPr>
             <w:tcW w:w="785" w:type="dxa"/>
             <w:vMerge w:val="restart"/>
-            <w:shd w:val="clear" w:color="auto" w:fill="FFFF00"/>
+            <w:shd w:val="clear" w:color="auto" w:fill="auto"/>
             <w:vAlign w:val="center"/>
           </w:tcPr>
           <w:p>
@@ -2362,7 +2392,7 @@
           <w:tcPr>
             <w:tcW w:w="785" w:type="dxa"/>
             <w:vMerge w:val="restart"/>
-            <w:shd w:val="clear" w:color="auto" w:fill="FFFF00"/>
+            <w:shd w:val="clear" w:color="auto" w:fill="auto"/>
             <w:vAlign w:val="center"/>
           </w:tcPr>
           <w:p>
@@ -2548,7 +2578,7 @@
           <w:tcPr>
             <w:tcW w:w="785" w:type="dxa"/>
             <w:vMerge w:val="restart"/>
-            <w:shd w:val="clear" w:color="auto" w:fill="FFFF00"/>
+            <w:shd w:val="clear" w:color="auto" w:fill="auto"/>
             <w:vAlign w:val="center"/>
           </w:tcPr>
           <w:p>
@@ -2734,7 +2764,7 @@
           <w:tcPr>
             <w:tcW w:w="785" w:type="dxa"/>
             <w:vMerge w:val="restart"/>
-            <w:shd w:val="clear" w:color="auto" w:fill="FFFF00"/>
+            <w:shd w:val="clear" w:color="auto" w:fill="auto"/>
             <w:vAlign w:val="center"/>
           </w:tcPr>
           <w:p>
@@ -2920,7 +2950,7 @@
           <w:tcPr>
             <w:tcW w:w="785" w:type="dxa"/>
             <w:vMerge w:val="restart"/>
-            <w:shd w:val="clear" w:color="auto" w:fill="FFFF00"/>
+            <w:shd w:val="clear" w:color="auto" w:fill="auto"/>
             <w:vAlign w:val="center"/>
           </w:tcPr>
           <w:p>
@@ -3106,7 +3136,7 @@
           <w:tcPr>
             <w:tcW w:w="785" w:type="dxa"/>
             <w:vMerge w:val="restart"/>
-            <w:shd w:val="clear" w:color="auto" w:fill="FFFF00"/>
+            <w:shd w:val="clear" w:color="auto" w:fill="auto"/>
             <w:vAlign w:val="center"/>
           </w:tcPr>
           <w:p>
@@ -3292,7 +3322,7 @@
           <w:tcPr>
             <w:tcW w:w="785" w:type="dxa"/>
             <w:vMerge w:val="restart"/>
-            <w:shd w:val="clear" w:color="auto" w:fill="FFFF00"/>
+            <w:shd w:val="clear" w:color="auto" w:fill="auto"/>
             <w:vAlign w:val="center"/>
           </w:tcPr>
           <w:p>
@@ -3478,7 +3508,7 @@
           <w:tcPr>
             <w:tcW w:w="785" w:type="dxa"/>
             <w:vMerge w:val="restart"/>
-            <w:shd w:val="clear" w:color="auto" w:fill="FFFF00"/>
+            <w:shd w:val="clear" w:color="auto" w:fill="auto"/>
             <w:vAlign w:val="center"/>
           </w:tcPr>
           <w:p>
@@ -3664,7 +3694,7 @@
           <w:tcPr>
             <w:tcW w:w="785" w:type="dxa"/>
             <w:vMerge w:val="restart"/>
-            <w:shd w:val="clear" w:color="auto" w:fill="FFFF00"/>
+            <w:shd w:val="clear" w:color="auto" w:fill="auto"/>
             <w:vAlign w:val="center"/>
           </w:tcPr>
           <w:p>
@@ -3761,6 +3791,192 @@
             <w:tcW w:w="1002" w:type="dxa"/>
             <w:shd w:val="clear" w:color="auto" w:fill="auto"/>
             <w:vAlign w:val="center"/>
+          </w:tcPr>
+          <w:p>
+            <w:pPr>
+              <w:jc w:val="center"/>
+            </w:pPr>
+            <w:r>
+              <w:t>3102,026</w:t>
+            </w:r>
+          </w:p>
+        </w:tc>
+        <w:tc>
+          <w:tcPr>
+            <w:tcW w:w="1046" w:type="dxa"/>
+            <w:shd w:val="clear" w:color="auto" w:fill="auto"/>
+            <w:vAlign w:val="center"/>
+          </w:tcPr>
+          <w:p>
+            <w:pPr>
+              <w:jc w:val="center"/>
+            </w:pPr>
+            <w:r>
+              <w:t>3412,229</w:t>
+            </w:r>
+          </w:p>
+        </w:tc>
+        <w:tc>
+          <w:tcPr>
+            <w:tcW w:w="1310" w:type="dxa"/>
+            <w:shd w:val="clear" w:color="auto" w:fill="auto"/>
+            <w:vAlign w:val="center"/>
+          </w:tcPr>
+          <w:p>
+            <w:pPr>
+              <w:jc w:val="center"/>
+            </w:pPr>
+            <w:r>
+              <w:t>41,22</w:t>
+            </w:r>
+          </w:p>
+        </w:tc>
+        <w:tc>
+          <w:tcPr>
+            <w:tcW w:w="795" w:type="dxa"/>
+            <w:shd w:val="clear" w:color="auto" w:fill="auto"/>
+            <w:vAlign w:val="center"/>
+          </w:tcPr>
+          <w:p>
+            <w:pPr>
+              <w:jc w:val="center"/>
+            </w:pPr>
+            <w:r>
+              <w:t>6,53</w:t>
+            </w:r>
+          </w:p>
+        </w:tc>
+        <w:tc>
+          <w:tcPr>
+            <w:tcW w:w="785" w:type="dxa"/>
+            <w:shd w:val="clear" w:color="auto" w:fill="auto"/>
+            <w:vAlign w:val="center"/>
+          </w:tcPr>
+          <w:p>
+            <w:pPr>
+              <w:jc w:val="center"/>
+            </w:pPr>
+            <w:r>
+              <w:t>2,96</w:t>
+            </w:r>
+          </w:p>
+        </w:tc>
+        <w:tc>
+          <w:tcPr>
+            <w:tcW w:w="781" w:type="dxa"/>
+            <w:shd w:val="clear" w:color="auto" w:fill="auto"/>
+            <w:vAlign w:val="center"/>
+          </w:tcPr>
+          <w:p>
+            <w:pPr>
+              <w:jc w:val="center"/>
+            </w:pPr>
+            <w:r>
+              <w:t>1,32</w:t>
+            </w:r>
+          </w:p>
+        </w:tc>
+        <w:tc>
+          <w:tcPr>
+            <w:tcW w:w="785" w:type="dxa"/>
+            <w:vMerge w:val="restart"/>
+            <w:shd w:val="clear" w:color="auto" w:fill="auto"/>
+            <w:vAlign w:val="center"/>
+          </w:tcPr>
+          <w:p>
+            <w:pPr>
+              <w:jc w:val="center"/>
+            </w:pPr>
+            <w:r>
+              <w:t>-</w:t>
+            </w:r>
+          </w:p>
+        </w:tc>
+        <w:tc>
+          <w:tcPr>
+            <w:tcW w:w="785" w:type="dxa"/>
+            <w:vMerge w:val="restart"/>
+            <w:shd w:val="clear" w:color="auto" w:fill="auto"/>
+            <w:vAlign w:val="center"/>
+          </w:tcPr>
+          <w:p>
+            <w:pPr>
+              <w:jc w:val="center"/>
+            </w:pPr>
+            <w:r>
+              <w:t>65</w:t>
+            </w:r>
+          </w:p>
+        </w:tc>
+        <w:tc>
+          <w:tcPr>
+            <w:tcW w:w="916" w:type="dxa"/>
+            <w:vMerge w:val="restart"/>
+            <w:shd w:val="clear" w:color="auto" w:fill="auto"/>
+            <w:vAlign w:val="center"/>
+          </w:tcPr>
+          <w:p>
+            <w:pPr>
+              <w:jc w:val="center"/>
+            </w:pPr>
+            <w:r>
+              <w:t>30</w:t>
+            </w:r>
+          </w:p>
+        </w:tc>
+        <w:tc>
+          <w:tcPr>
+            <w:tcW w:w="787" w:type="dxa"/>
+            <w:vMerge w:val="restart"/>
+            <w:shd w:val="clear" w:color="auto" w:fill="auto"/>
+            <w:vAlign w:val="center"/>
+          </w:tcPr>
+          <w:p>
+            <w:pPr>
+              <w:jc w:val="center"/>
+            </w:pPr>
+            <w:r>
+              <w:t>14</w:t>
+            </w:r>
+          </w:p>
+        </w:tc>
+        <w:tc>
+          <w:tcPr>
+            <w:tcW w:w="760" w:type="dxa"/>
+            <w:shd w:val="clear" w:color="auto" w:fill="auto"/>
+            <w:vAlign w:val="center"/>
+          </w:tcPr>
+          <w:p>
+            <w:pPr>
+              <w:jc w:val="center"/>
+            </w:pPr>
+            <w:r>
+              <w:t>-</w:t>
+            </w:r>
+          </w:p>
+        </w:tc>
+      </w:tr>
+      <w:tr>
+        <w:tc>
+          <w:tcPr>
+            <w:tcW w:w="386" w:type="dxa"/>
+            <w:shd w:val="clear" w:color="auto" w:fill="auto"/>
+            <w:vAlign w:val="center"/>
+          </w:tcPr>
+          <w:p>
+            <w:pPr>
+              <w:jc w:val="center"/>
+            </w:pPr>
+            <w:r>
+              <w:t>13</w:t>
+            </w:r>
+          </w:p>
+        </w:tc>
+        <w:tc>
+          <w:tcPr>
+            <w:tcW w:w="1002" w:type="dxa"/>
+            <w:shd w:val="clear" w:color="auto" w:fill="auto"/>
+            <w:vAlign w:val="center"/>
             <w:shd w:fill="FFFF00"/>
             <w:shd w:fill="FFFF00"/>
           </w:tcPr>
@@ -3769,7 +3985,7 @@
               <w:jc w:val="center"/>
             </w:pPr>
             <w:r>
-              <w:t>3102,026</w:t>
+              <w:t>3722,431</w:t>
             </w:r>
           </w:p>
         </w:tc>
@@ -3786,7 +4002,7 @@
               <w:jc w:val="center"/>
             </w:pPr>
             <w:r>
-              <w:t>3412,229</w:t>
+              <w:t>4032,634</w:t>
             </w:r>
           </w:p>
         </w:tc>
@@ -3801,7 +4017,7 @@
               <w:jc w:val="center"/>
             </w:pPr>
             <w:r>
-              <w:t>41,22</w:t>
+              <w:t>42,59</w:t>
             </w:r>
           </w:p>
         </w:tc>
@@ -3816,22 +4032,22 @@
               <w:jc w:val="center"/>
             </w:pPr>
             <w:r>
-              <w:t>6,53</w:t>
-            </w:r>
-          </w:p>
-        </w:tc>
-        <w:tc>
-          <w:tcPr>
-            <w:tcW w:w="785" w:type="dxa"/>
-            <w:shd w:val="clear" w:color="auto" w:fill="auto"/>
-            <w:vAlign w:val="center"/>
-          </w:tcPr>
-          <w:p>
-            <w:pPr>
-              <w:jc w:val="center"/>
-            </w:pPr>
-            <w:r>
-              <w:t>2,96</w:t>
+              <w:t>7,65</w:t>
+            </w:r>
+          </w:p>
+        </w:tc>
+        <w:tc>
+          <w:tcPr>
+            <w:tcW w:w="785" w:type="dxa"/>
+            <w:shd w:val="clear" w:color="auto" w:fill="auto"/>
+            <w:vAlign w:val="center"/>
+          </w:tcPr>
+          <w:p>
+            <w:pPr>
+              <w:jc w:val="center"/>
+            </w:pPr>
+            <w:r>
+              <w:t>3,57</w:t>
             </w:r>
           </w:p>
         </w:tc>
@@ -3846,15 +4062,15 @@
               <w:jc w:val="center"/>
             </w:pPr>
             <w:r>
-              <w:t>1,32</w:t>
-            </w:r>
-          </w:p>
-        </w:tc>
-        <w:tc>
-          <w:tcPr>
-            <w:tcW w:w="785" w:type="dxa"/>
-            <w:vMerge w:val="restart"/>
-            <w:shd w:val="clear" w:color="auto" w:fill="FFFF00"/>
+              <w:t>1,59</w:t>
+            </w:r>
+          </w:p>
+        </w:tc>
+        <w:tc>
+          <w:tcPr>
+            <w:tcW w:w="785" w:type="dxa"/>
+            <w:vMerge w:val="restart"/>
+            <w:shd w:val="clear" w:color="auto" w:fill="auto"/>
             <w:vAlign w:val="center"/>
           </w:tcPr>
           <w:p>
@@ -3869,6 +4085,38 @@
         <w:tc>
           <w:tcPr>
             <w:tcW w:w="785" w:type="dxa"/>
+            <w:vMerge w:val="restart"/>
+            <w:shd w:val="clear" w:color="auto" w:fill="auto"/>
+            <w:vAlign w:val="center"/>
+          </w:tcPr>
+          <w:p>
+            <w:pPr>
+              <w:jc w:val="center"/>
+            </w:pPr>
+            <w:r>
+              <w:t>60</w:t>
+            </w:r>
+          </w:p>
+        </w:tc>
+        <w:tc>
+          <w:tcPr>
+            <w:tcW w:w="916" w:type="dxa"/>
+            <w:vMerge w:val="restart"/>
+            <w:shd w:val="clear" w:color="auto" w:fill="auto"/>
+            <w:vAlign w:val="center"/>
+          </w:tcPr>
+          <w:p>
+            <w:pPr>
+              <w:jc w:val="center"/>
+            </w:pPr>
+            <w:r>
+              <w:t>36</w:t>
+            </w:r>
+          </w:p>
+        </w:tc>
+        <w:tc>
+          <w:tcPr>
+            <w:tcW w:w="787" w:type="dxa"/>
             <w:vMerge w:val="restart"/>
             <w:shd w:val="clear" w:color="auto" w:fill="auto"/>
             <w:vAlign w:val="center"/>
@@ -3880,39 +4128,7 @@
               <w:jc w:val="center"/>
             </w:pPr>
             <w:r>
-              <w:t>65</w:t>
-            </w:r>
-          </w:p>
-        </w:tc>
-        <w:tc>
-          <w:tcPr>
-            <w:tcW w:w="916" w:type="dxa"/>
-            <w:vMerge w:val="restart"/>
-            <w:shd w:val="clear" w:color="auto" w:fill="auto"/>
-            <w:vAlign w:val="center"/>
-          </w:tcPr>
-          <w:p>
-            <w:pPr>
-              <w:jc w:val="center"/>
-            </w:pPr>
-            <w:r>
-              <w:t>30</w:t>
-            </w:r>
-          </w:p>
-        </w:tc>
-        <w:tc>
-          <w:tcPr>
-            <w:tcW w:w="787" w:type="dxa"/>
-            <w:vMerge w:val="restart"/>
-            <w:shd w:val="clear" w:color="auto" w:fill="auto"/>
-            <w:vAlign w:val="center"/>
-          </w:tcPr>
-          <w:p>
-            <w:pPr>
-              <w:jc w:val="center"/>
-            </w:pPr>
-            <w:r>
-              <w:t>14</w:t>
+              <w:t>21</w:t>
             </w:r>
           </w:p>
         </w:tc>
@@ -3944,14 +4160,14 @@
               <w:jc w:val="center"/>
             </w:pPr>
             <w:r>
-              <w:t>13</w:t>
+              <w:t>14</w:t>
             </w:r>
           </w:p>
         </w:tc>
         <w:tc>
           <w:tcPr>
             <w:tcW w:w="1002" w:type="dxa"/>
-            <w:shd w:val="clear" w:color="auto" w:fill="auto"/>
+            <w:shd w:val="clear" w:color="auto" w:fill="FFFF00"/>
             <w:vAlign w:val="center"/>
             <w:shd w:fill="FFFF00"/>
             <w:shd w:fill="FFFF00"/>
@@ -3961,14 +4177,14 @@
               <w:jc w:val="center"/>
             </w:pPr>
             <w:r>
-              <w:t>3722,431</w:t>
+              <w:t>4032,634</w:t>
             </w:r>
           </w:p>
         </w:tc>
         <w:tc>
           <w:tcPr>
             <w:tcW w:w="1046" w:type="dxa"/>
-            <w:shd w:val="clear" w:color="auto" w:fill="auto"/>
+            <w:shd w:val="clear" w:color="auto" w:fill="FFFF00"/>
             <w:vAlign w:val="center"/>
             <w:shd w:fill="FFFF00"/>
             <w:shd w:fill="FFFF00"/>
@@ -3978,7 +4194,7 @@
               <w:jc w:val="center"/>
             </w:pPr>
             <w:r>
-              <w:t>4032,634</w:t>
+              <w:t>4342,836</w:t>
             </w:r>
           </w:p>
         </w:tc>
@@ -3993,7 +4209,7 @@
               <w:jc w:val="center"/>
             </w:pPr>
             <w:r>
-              <w:t>42,59</w:t>
+              <w:t>43,35</w:t>
             </w:r>
           </w:p>
         </w:tc>
@@ -4008,22 +4224,22 @@
               <w:jc w:val="center"/>
             </w:pPr>
             <w:r>
-              <w:t>7,65</w:t>
-            </w:r>
-          </w:p>
-        </w:tc>
-        <w:tc>
-          <w:tcPr>
-            <w:tcW w:w="785" w:type="dxa"/>
-            <w:shd w:val="clear" w:color="auto" w:fill="auto"/>
-            <w:vAlign w:val="center"/>
-          </w:tcPr>
-          <w:p>
-            <w:pPr>
-              <w:jc w:val="center"/>
-            </w:pPr>
-            <w:r>
-              <w:t>3,57</w:t>
+              <w:t>8,35</w:t>
+            </w:r>
+          </w:p>
+        </w:tc>
+        <w:tc>
+          <w:tcPr>
+            <w:tcW w:w="785" w:type="dxa"/>
+            <w:shd w:val="clear" w:color="auto" w:fill="auto"/>
+            <w:vAlign w:val="center"/>
+          </w:tcPr>
+          <w:p>
+            <w:pPr>
+              <w:jc w:val="center"/>
+            </w:pPr>
+            <w:r>
+              <w:t>3,94</w:t>
             </w:r>
           </w:p>
         </w:tc>
@@ -4038,7 +4254,23 @@
               <w:jc w:val="center"/>
             </w:pPr>
             <w:r>
-              <w:t>1,59</w:t>
+              <w:t>1,76</w:t>
+            </w:r>
+          </w:p>
+        </w:tc>
+        <w:tc>
+          <w:tcPr>
+            <w:tcW w:w="785" w:type="dxa"/>
+            <w:vMerge w:val="restart"/>
+            <w:shd w:val="clear" w:color="auto" w:fill="auto"/>
+            <w:vAlign w:val="center"/>
+          </w:tcPr>
+          <w:p>
+            <w:pPr>
+              <w:jc w:val="center"/>
+            </w:pPr>
+            <w:r>
+              <w:t>-</w:t>
             </w:r>
           </w:p>
         </w:tc>
@@ -4047,22 +4279,6 @@
             <w:tcW w:w="785" w:type="dxa"/>
             <w:vMerge w:val="restart"/>
             <w:shd w:val="clear" w:color="auto" w:fill="FFFF00"/>
-            <w:vAlign w:val="center"/>
-          </w:tcPr>
-          <w:p>
-            <w:pPr>
-              <w:jc w:val="center"/>
-            </w:pPr>
-            <w:r>
-              <w:t>-</w:t>
-            </w:r>
-          </w:p>
-        </w:tc>
-        <w:tc>
-          <w:tcPr>
-            <w:tcW w:w="785" w:type="dxa"/>
-            <w:vMerge w:val="restart"/>
-            <w:shd w:val="clear" w:color="auto" w:fill="auto"/>
             <w:vAlign w:val="center"/>
             <w:shd w:fill="FFFF00"/>
             <w:shd w:fill="FFFF00"/>
@@ -4072,7 +4288,7 @@
               <w:jc w:val="center"/>
             </w:pPr>
             <w:r>
-              <w:t>77</w:t>
+              <w:t>84</w:t>
             </w:r>
           </w:p>
         </w:tc>
@@ -4088,7 +4304,7 @@
               <w:jc w:val="center"/>
             </w:pPr>
             <w:r>
-              <w:t>36</w:t>
+              <w:t>40</w:t>
             </w:r>
           </w:p>
         </w:tc>
@@ -4104,7 +4320,7 @@
               <w:jc w:val="center"/>
             </w:pPr>
             <w:r>
-              <w:t>16</w:t>
+              <w:t>18</w:t>
             </w:r>
           </w:p>
         </w:tc>
@@ -4136,206 +4352,14 @@
               <w:jc w:val="center"/>
             </w:pPr>
             <w:r>
-              <w:t>14</w:t>
+              <w:t>15</w:t>
             </w:r>
           </w:p>
         </w:tc>
         <w:tc>
           <w:tcPr>
             <w:tcW w:w="1002" w:type="dxa"/>
-            <w:shd w:val="clear" w:color="auto" w:fill="auto"/>
-            <w:vAlign w:val="center"/>
-            <w:shd w:fill="FFFF00"/>
-            <w:shd w:fill="FFFF00"/>
-          </w:tcPr>
-          <w:p>
-            <w:pPr>
-              <w:jc w:val="center"/>
-            </w:pPr>
-            <w:r>
-              <w:t>4032,634</w:t>
-            </w:r>
-          </w:p>
-        </w:tc>
-        <w:tc>
-          <w:tcPr>
-            <w:tcW w:w="1046" w:type="dxa"/>
-            <w:shd w:val="clear" w:color="auto" w:fill="auto"/>
-            <w:vAlign w:val="center"/>
-            <w:shd w:fill="FFFF00"/>
-            <w:shd w:fill="FFFF00"/>
-          </w:tcPr>
-          <w:p>
-            <w:pPr>
-              <w:jc w:val="center"/>
-            </w:pPr>
-            <w:r>
-              <w:t>4342,836</w:t>
-            </w:r>
-          </w:p>
-        </w:tc>
-        <w:tc>
-          <w:tcPr>
-            <w:tcW w:w="1310" w:type="dxa"/>
-            <w:shd w:val="clear" w:color="auto" w:fill="auto"/>
-            <w:vAlign w:val="center"/>
-          </w:tcPr>
-          <w:p>
-            <w:pPr>
-              <w:jc w:val="center"/>
-            </w:pPr>
-            <w:r>
-              <w:t>43,35</w:t>
-            </w:r>
-          </w:p>
-        </w:tc>
-        <w:tc>
-          <w:tcPr>
-            <w:tcW w:w="795" w:type="dxa"/>
-            <w:shd w:val="clear" w:color="auto" w:fill="auto"/>
-            <w:vAlign w:val="center"/>
-          </w:tcPr>
-          <w:p>
-            <w:pPr>
-              <w:jc w:val="center"/>
-            </w:pPr>
-            <w:r>
-              <w:t>8,35</w:t>
-            </w:r>
-          </w:p>
-        </w:tc>
-        <w:tc>
-          <w:tcPr>
-            <w:tcW w:w="785" w:type="dxa"/>
-            <w:shd w:val="clear" w:color="auto" w:fill="auto"/>
-            <w:vAlign w:val="center"/>
-          </w:tcPr>
-          <w:p>
-            <w:pPr>
-              <w:jc w:val="center"/>
-            </w:pPr>
-            <w:r>
-              <w:t>3,94</w:t>
-            </w:r>
-          </w:p>
-        </w:tc>
-        <w:tc>
-          <w:tcPr>
-            <w:tcW w:w="781" w:type="dxa"/>
-            <w:shd w:val="clear" w:color="auto" w:fill="auto"/>
-            <w:vAlign w:val="center"/>
-          </w:tcPr>
-          <w:p>
-            <w:pPr>
-              <w:jc w:val="center"/>
-            </w:pPr>
-            <w:r>
-              <w:t>1,76</w:t>
-            </w:r>
-          </w:p>
-        </w:tc>
-        <w:tc>
-          <w:tcPr>
-            <w:tcW w:w="785" w:type="dxa"/>
-            <w:vMerge w:val="restart"/>
             <w:shd w:val="clear" w:color="auto" w:fill="FFFF00"/>
-            <w:vAlign w:val="center"/>
-          </w:tcPr>
-          <w:p>
-            <w:pPr>
-              <w:jc w:val="center"/>
-            </w:pPr>
-            <w:r>
-              <w:t>-</w:t>
-            </w:r>
-          </w:p>
-        </w:tc>
-        <w:tc>
-          <w:tcPr>
-            <w:tcW w:w="785" w:type="dxa"/>
-            <w:vMerge w:val="restart"/>
-            <w:shd w:val="clear" w:color="auto" w:fill="auto"/>
-            <w:vAlign w:val="center"/>
-            <w:shd w:fill="FFFF00"/>
-            <w:shd w:fill="FFFF00"/>
-          </w:tcPr>
-          <w:p>
-            <w:pPr>
-              <w:jc w:val="center"/>
-            </w:pPr>
-            <w:r>
-              <w:t>84</w:t>
-            </w:r>
-          </w:p>
-        </w:tc>
-        <w:tc>
-          <w:tcPr>
-            <w:tcW w:w="916" w:type="dxa"/>
-            <w:vMerge w:val="restart"/>
-            <w:shd w:val="clear" w:color="auto" w:fill="auto"/>
-            <w:vAlign w:val="center"/>
-          </w:tcPr>
-          <w:p>
-            <w:pPr>
-              <w:jc w:val="center"/>
-            </w:pPr>
-            <w:r>
-              <w:t>40</w:t>
-            </w:r>
-          </w:p>
-        </w:tc>
-        <w:tc>
-          <w:tcPr>
-            <w:tcW w:w="787" w:type="dxa"/>
-            <w:vMerge w:val="restart"/>
-            <w:shd w:val="clear" w:color="auto" w:fill="auto"/>
-            <w:vAlign w:val="center"/>
-          </w:tcPr>
-          <w:p>
-            <w:pPr>
-              <w:jc w:val="center"/>
-            </w:pPr>
-            <w:r>
-              <w:t>18</w:t>
-            </w:r>
-          </w:p>
-        </w:tc>
-        <w:tc>
-          <w:tcPr>
-            <w:tcW w:w="760" w:type="dxa"/>
-            <w:shd w:val="clear" w:color="auto" w:fill="auto"/>
-            <w:vAlign w:val="center"/>
-          </w:tcPr>
-          <w:p>
-            <w:pPr>
-              <w:jc w:val="center"/>
-            </w:pPr>
-            <w:r>
-              <w:t>-</w:t>
-            </w:r>
-          </w:p>
-        </w:tc>
-      </w:tr>
-      <w:tr>
-        <w:tc>
-          <w:tcPr>
-            <w:tcW w:w="386" w:type="dxa"/>
-            <w:shd w:val="clear" w:color="auto" w:fill="auto"/>
-            <w:vAlign w:val="center"/>
-          </w:tcPr>
-          <w:p>
-            <w:pPr>
-              <w:jc w:val="center"/>
-            </w:pPr>
-            <w:r>
-              <w:t>15</w:t>
-            </w:r>
-          </w:p>
-        </w:tc>
-        <w:tc>
-          <w:tcPr>
-            <w:tcW w:w="1002" w:type="dxa"/>
-            <w:shd w:val="clear" w:color="auto" w:fill="auto"/>
             <w:vAlign w:val="center"/>
             <w:shd w:fill="FFFF00"/>
             <w:shd w:fill="FFFF00"/>
@@ -4354,7 +4378,7 @@
         <w:tc>
           <w:tcPr>
             <w:tcW w:w="1046" w:type="dxa"/>
-            <w:shd w:val="clear" w:color="auto" w:fill="auto"/>
+            <w:shd w:val="clear" w:color="auto" w:fill="FFFF00"/>
             <w:vAlign w:val="center"/>
             <w:shd w:fill="FFFF00"/>
             <w:shd w:fill="FFFF00"/>
@@ -4434,23 +4458,23 @@
           <w:tcPr>
             <w:tcW w:w="785" w:type="dxa"/>
             <w:vMerge w:val="restart"/>
+            <w:shd w:val="clear" w:color="auto" w:fill="auto"/>
+            <w:vAlign w:val="center"/>
+          </w:tcPr>
+          <w:p>
+            <w:pPr>
+              <w:jc w:val="center"/>
+            </w:pPr>
+            <w:r>
+              <w:t>-</w:t>
+            </w:r>
+          </w:p>
+        </w:tc>
+        <w:tc>
+          <w:tcPr>
+            <w:tcW w:w="785" w:type="dxa"/>
+            <w:vMerge w:val="restart"/>
             <w:shd w:val="clear" w:color="auto" w:fill="FFFF00"/>
-            <w:vAlign w:val="center"/>
-          </w:tcPr>
-          <w:p>
-            <w:pPr>
-              <w:jc w:val="center"/>
-            </w:pPr>
-            <w:r>
-              <w:t>-</w:t>
-            </w:r>
-          </w:p>
-        </w:tc>
-        <w:tc>
-          <w:tcPr>
-            <w:tcW w:w="785" w:type="dxa"/>
-            <w:vMerge w:val="restart"/>
-            <w:shd w:val="clear" w:color="auto" w:fill="auto"/>
             <w:vAlign w:val="center"/>
             <w:shd w:fill="FFFF00"/>
             <w:shd w:fill="FFFF00"/>
@@ -4468,7 +4492,7 @@
           <w:tcPr>
             <w:tcW w:w="916" w:type="dxa"/>
             <w:vMerge w:val="restart"/>
-            <w:shd w:val="clear" w:color="auto" w:fill="auto"/>
+            <w:shd w:val="clear" w:color="auto" w:fill="FFFF00"/>
             <w:vAlign w:val="center"/>
             <w:shd w:fill="FFFF00"/>
             <w:shd w:fill="FFFF00"/>
@@ -4567,9 +4591,18 @@
           <w:p>
             <w:pPr>
               <w:jc w:val="center"/>
-            </w:pPr>
-            <w:r>
-              <w:t>20</w:t>
+              <w:rPr>
+                <w:lang w:val="en-US"/>
+              </w:rPr>
+            </w:pPr>
+            <w:r>
+              <w:t>2</w:t>
+            </w:r>
+            <w:r>
+              <w:rPr>
+                <w:lang w:val="en-US"/>
+              </w:rPr>
+              <w:t>1</w:t>
             </w:r>
           </w:p>
         </w:tc>
@@ -4720,7 +4753,7 @@
           <w:tcPr>
             <w:tcW w:w="785" w:type="dxa"/>
             <w:vMerge w:val="restart"/>
-            <w:shd w:val="clear" w:color="auto" w:fill="FFFF00"/>
+            <w:shd w:val="clear" w:color="auto" w:fill="auto"/>
             <w:vAlign w:val="center"/>
           </w:tcPr>
           <w:p>
@@ -4906,7 +4939,7 @@
           <w:tcPr>
             <w:tcW w:w="785" w:type="dxa"/>
             <w:vMerge w:val="restart"/>
-            <w:shd w:val="clear" w:color="auto" w:fill="FFFF00"/>
+            <w:shd w:val="clear" w:color="auto" w:fill="auto"/>
             <w:vAlign w:val="center"/>
           </w:tcPr>
           <w:p>
@@ -5092,7 +5125,7 @@
           <w:tcPr>
             <w:tcW w:w="785" w:type="dxa"/>
             <w:vMerge w:val="restart"/>
-            <w:shd w:val="clear" w:color="auto" w:fill="FFFF00"/>
+            <w:shd w:val="clear" w:color="auto" w:fill="auto"/>
             <w:vAlign w:val="center"/>
           </w:tcPr>
           <w:p>
@@ -5374,7 +5407,7 @@
           <w:tcPr>
             <w:tcW w:w="785" w:type="dxa"/>
             <w:vMerge w:val="restart"/>
-            <w:shd w:val="clear" w:color="auto" w:fill="FFFF00"/>
+            <w:shd w:val="clear" w:color="auto" w:fill="auto"/>
             <w:vAlign w:val="center"/>
           </w:tcPr>
           <w:p>
@@ -5656,7 +5689,7 @@
           <w:tcPr>
             <w:tcW w:w="785" w:type="dxa"/>
             <w:vMerge w:val="restart"/>
-            <w:shd w:val="clear" w:color="auto" w:fill="FFFF00"/>
+            <w:shd w:val="clear" w:color="auto" w:fill="auto"/>
             <w:vAlign w:val="center"/>
           </w:tcPr>
           <w:p>
@@ -5843,7 +5876,7 @@
           <w:tcPr>
             <w:tcW w:w="785" w:type="dxa"/>
             <w:vMerge w:val="restart"/>
-            <w:shd w:val="clear" w:color="auto" w:fill="FFFF00"/>
+            <w:shd w:val="clear" w:color="auto" w:fill="auto"/>
             <w:vAlign w:val="center"/>
           </w:tcPr>
           <w:p>
@@ -6029,7 +6062,7 @@
           <w:tcPr>
             <w:tcW w:w="785" w:type="dxa"/>
             <w:vMerge w:val="restart"/>
-            <w:shd w:val="clear" w:color="auto" w:fill="FFFF00"/>
+            <w:shd w:val="clear" w:color="auto" w:fill="auto"/>
             <w:vAlign w:val="center"/>
           </w:tcPr>
           <w:p>
@@ -6215,7 +6248,7 @@
           <w:tcPr>
             <w:tcW w:w="785" w:type="dxa"/>
             <w:vMerge w:val="restart"/>
-            <w:shd w:val="clear" w:color="auto" w:fill="FFFF00"/>
+            <w:shd w:val="clear" w:color="auto" w:fill="auto"/>
             <w:vAlign w:val="center"/>
           </w:tcPr>
           <w:p>
@@ -6401,7 +6434,7 @@
           <w:tcPr>
             <w:tcW w:w="785" w:type="dxa"/>
             <w:vMerge w:val="restart"/>
-            <w:shd w:val="clear" w:color="auto" w:fill="FFFF00"/>
+            <w:shd w:val="clear" w:color="auto" w:fill="auto"/>
             <w:vAlign w:val="center"/>
           </w:tcPr>
           <w:p>
@@ -6683,7 +6716,7 @@
           <w:tcPr>
             <w:tcW w:w="785" w:type="dxa"/>
             <w:vMerge w:val="restart"/>
-            <w:shd w:val="clear" w:color="auto" w:fill="FFFF00"/>
+            <w:shd w:val="clear" w:color="auto" w:fill="auto"/>
             <w:vAlign w:val="center"/>
           </w:tcPr>
           <w:p>
@@ -6869,7 +6902,7 @@
           <w:tcPr>
             <w:tcW w:w="785" w:type="dxa"/>
             <w:vMerge w:val="restart"/>
-            <w:shd w:val="clear" w:color="auto" w:fill="FFFF00"/>
+            <w:shd w:val="clear" w:color="auto" w:fill="auto"/>
             <w:vAlign w:val="center"/>
           </w:tcPr>
           <w:p>
@@ -7055,7 +7088,7 @@
           <w:tcPr>
             <w:tcW w:w="785" w:type="dxa"/>
             <w:vMerge w:val="restart"/>
-            <w:shd w:val="clear" w:color="auto" w:fill="FFFF00"/>
+            <w:shd w:val="clear" w:color="auto" w:fill="auto"/>
             <w:vAlign w:val="center"/>
           </w:tcPr>
           <w:p>
@@ -7241,7 +7274,7 @@
           <w:tcPr>
             <w:tcW w:w="785" w:type="dxa"/>
             <w:vMerge w:val="restart"/>
-            <w:shd w:val="clear" w:color="auto" w:fill="FFFF00"/>
+            <w:shd w:val="clear" w:color="auto" w:fill="auto"/>
             <w:vAlign w:val="center"/>
           </w:tcPr>
           <w:p>
@@ -7427,7 +7460,7 @@
           <w:tcPr>
             <w:tcW w:w="785" w:type="dxa"/>
             <w:vMerge w:val="restart"/>
-            <w:shd w:val="clear" w:color="auto" w:fill="FFFF00"/>
+            <w:shd w:val="clear" w:color="auto" w:fill="auto"/>
             <w:vAlign w:val="center"/>
           </w:tcPr>
           <w:p>
@@ -7613,7 +7646,7 @@
           <w:tcPr>
             <w:tcW w:w="785" w:type="dxa"/>
             <w:vMerge w:val="restart"/>
-            <w:shd w:val="clear" w:color="auto" w:fill="FFFF00"/>
+            <w:shd w:val="clear" w:color="auto" w:fill="auto"/>
             <w:vAlign w:val="center"/>
           </w:tcPr>
           <w:p>
@@ -7799,7 +7832,7 @@
           <w:tcPr>
             <w:tcW w:w="785" w:type="dxa"/>
             <w:vMerge w:val="restart"/>
-            <w:shd w:val="clear" w:color="auto" w:fill="FFFF00"/>
+            <w:shd w:val="clear" w:color="auto" w:fill="auto"/>
             <w:vAlign w:val="center"/>
           </w:tcPr>
           <w:p>
@@ -7985,7 +8018,7 @@
           <w:tcPr>
             <w:tcW w:w="785" w:type="dxa"/>
             <w:vMerge w:val="restart"/>
-            <w:shd w:val="clear" w:color="auto" w:fill="FFFF00"/>
+            <w:shd w:val="clear" w:color="auto" w:fill="auto"/>
             <w:vAlign w:val="center"/>
           </w:tcPr>
           <w:p>
@@ -8267,7 +8300,7 @@
           <w:tcPr>
             <w:tcW w:w="785" w:type="dxa"/>
             <w:vMerge w:val="restart"/>
-            <w:shd w:val="clear" w:color="auto" w:fill="FFFF00"/>
+            <w:shd w:val="clear" w:color="auto" w:fill="auto"/>
             <w:vAlign w:val="center"/>
           </w:tcPr>
           <w:p>
@@ -8453,7 +8486,7 @@
           <w:tcPr>
             <w:tcW w:w="785" w:type="dxa"/>
             <w:vMerge w:val="restart"/>
-            <w:shd w:val="clear" w:color="auto" w:fill="FFFF00"/>
+            <w:shd w:val="clear" w:color="auto" w:fill="auto"/>
             <w:vAlign w:val="center"/>
           </w:tcPr>
           <w:p>
@@ -8639,7 +8672,7 @@
           <w:tcPr>
             <w:tcW w:w="785" w:type="dxa"/>
             <w:vMerge w:val="restart"/>
-            <w:shd w:val="clear" w:color="auto" w:fill="FFFF00"/>
+            <w:shd w:val="clear" w:color="auto" w:fill="auto"/>
             <w:vAlign w:val="center"/>
           </w:tcPr>
           <w:p>
@@ -8825,7 +8858,7 @@
           <w:tcPr>
             <w:tcW w:w="785" w:type="dxa"/>
             <w:vMerge w:val="restart"/>
-            <w:shd w:val="clear" w:color="auto" w:fill="FFFF00"/>
+            <w:shd w:val="clear" w:color="auto" w:fill="auto"/>
             <w:vAlign w:val="center"/>
           </w:tcPr>
           <w:p>
@@ -9011,7 +9044,7 @@
           <w:tcPr>
             <w:tcW w:w="785" w:type="dxa"/>
             <w:vMerge w:val="restart"/>
-            <w:shd w:val="clear" w:color="auto" w:fill="FFFF00"/>
+            <w:shd w:val="clear" w:color="auto" w:fill="auto"/>
             <w:vAlign w:val="center"/>
           </w:tcPr>
           <w:p>
@@ -9197,7 +9230,7 @@
           <w:tcPr>
             <w:tcW w:w="785" w:type="dxa"/>
             <w:vMerge w:val="restart"/>
-            <w:shd w:val="clear" w:color="auto" w:fill="FFFF00"/>
+            <w:shd w:val="clear" w:color="auto" w:fill="auto"/>
             <w:vAlign w:val="center"/>
           </w:tcPr>
           <w:p>
@@ -9479,7 +9512,7 @@
           <w:tcPr>
             <w:tcW w:w="785" w:type="dxa"/>
             <w:vMerge w:val="restart"/>
-            <w:shd w:val="clear" w:color="auto" w:fill="FFFF00"/>
+            <w:shd w:val="clear" w:color="auto" w:fill="auto"/>
             <w:vAlign w:val="center"/>
           </w:tcPr>
           <w:p>
@@ -17959,7 +17992,7 @@
           <w:insideH w:val="single" w:sz="4" w:space="0" w:color="auto"/>
           <w:insideV w:val="single" w:sz="4" w:space="0" w:color="auto"/>
         </w:tblBorders>
-        <w:tblLook w:val="04A0"/>
+        <w:tblLook w:val="04A0" w:firstRow="1" w:lastRow="0" w:firstColumn="1" w:lastColumn="0" w:noHBand="0" w:noVBand="1"/>
       </w:tblPr>
       <w:tblGrid>
         <w:gridCol w:w="416"/>
@@ -26783,7 +26816,7 @@
           <w:insideH w:val="single" w:sz="4" w:space="0" w:color="auto"/>
           <w:insideV w:val="single" w:sz="4" w:space="0" w:color="auto"/>
         </w:tblBorders>
-        <w:tblLook w:val="04A0"/>
+        <w:tblLook w:val="04A0" w:firstRow="1" w:lastRow="0" w:firstColumn="1" w:lastColumn="0" w:noHBand="0" w:noVBand="1"/>
       </w:tblPr>
       <w:tblGrid>
         <w:gridCol w:w="510"/>
@@ -29468,7 +29501,7 @@
           <w:insideH w:val="single" w:sz="4" w:space="0" w:color="auto"/>
           <w:insideV w:val="single" w:sz="4" w:space="0" w:color="auto"/>
         </w:tblBorders>
-        <w:tblLook w:val="04A0"/>
+        <w:tblLook w:val="04A0" w:firstRow="1" w:lastRow="0" w:firstColumn="1" w:lastColumn="0" w:noHBand="0" w:noVBand="1"/>
       </w:tblPr>
       <w:tblGrid>
         <w:gridCol w:w="510"/>
@@ -31101,7 +31134,7 @@
           <w:insideH w:val="single" w:sz="4" w:space="0" w:color="auto"/>
           <w:insideV w:val="single" w:sz="4" w:space="0" w:color="auto"/>
         </w:tblBorders>
-        <w:tblLook w:val="04A0"/>
+        <w:tblLook w:val="04A0" w:firstRow="1" w:lastRow="0" w:firstColumn="1" w:lastColumn="0" w:noHBand="0" w:noVBand="1"/>
       </w:tblPr>
       <w:tblGrid>
         <w:gridCol w:w="382"/>
@@ -32406,7 +32439,7 @@
           <w:insideH w:val="single" w:sz="4" w:space="0" w:color="auto"/>
           <w:insideV w:val="single" w:sz="4" w:space="0" w:color="auto"/>
         </w:tblBorders>
-        <w:tblLook w:val="04A0"/>
+        <w:tblLook w:val="04A0" w:firstRow="1" w:lastRow="0" w:firstColumn="1" w:lastColumn="0" w:noHBand="0" w:noVBand="1"/>
       </w:tblPr>
       <w:tblGrid>
         <w:gridCol w:w="384"/>
@@ -33381,7 +33414,6 @@
       <w:tblPr>
         <w:tblW w:w="10212" w:type="dxa"/>
         <w:jc w:val="center"/>
-        <w:tblInd w:w="197" w:type="dxa"/>
         <w:tblBorders>
           <w:top w:val="single" w:sz="4" w:space="0" w:color="auto"/>
           <w:left w:val="single" w:sz="4" w:space="0" w:color="auto"/>
@@ -33391,7 +33423,7 @@
           <w:insideV w:val="single" w:sz="4" w:space="0" w:color="auto"/>
         </w:tblBorders>
         <w:tblLayout w:type="fixed"/>
-        <w:tblLook w:val="01E0"/>
+        <w:tblLook w:val="01E0" w:firstRow="1" w:lastRow="1" w:firstColumn="1" w:lastColumn="1" w:noHBand="0" w:noVBand="0"/>
       </w:tblPr>
       <w:tblGrid>
         <w:gridCol w:w="429"/>
@@ -33974,7 +34006,6 @@
               <w:jc w:val="center"/>
             </w:pPr>
             <w:r>
-              <w:lastRenderedPageBreak/>
               <w:t>3</w:t>
             </w:r>
           </w:p>
@@ -34739,15 +34770,15 @@
 </file>
 
 <file path=word/endnotes.xml><?xml version="1.0" encoding="utf-8"?>
-<w:endnotes xmlns:ve="http://schemas.openxmlformats.org/markup-compatibility/2006" xmlns:o="urn:schemas-microsoft-com:office:office" xmlns:r="http://schemas.openxmlformats.org/officeDocument/2006/relationships" xmlns:m="http://schemas.openxmlformats.org/officeDocument/2006/math" xmlns:v="urn:schemas-microsoft-com:vml" xmlns:wp="http://schemas.openxmlformats.org/drawingml/2006/wordprocessingDrawing" xmlns:w10="urn:schemas-microsoft-com:office:word" xmlns:w="http://schemas.openxmlformats.org/wordprocessingml/2006/main" xmlns:wne="http://schemas.microsoft.com/office/word/2006/wordml">
-  <w:endnote w:type="separator" w:id="0">
+<w:endnotes xmlns:wpc="http://schemas.microsoft.com/office/word/2010/wordprocessingCanvas" xmlns:cx="http://schemas.microsoft.com/office/drawing/2014/chartex" xmlns:cx1="http://schemas.microsoft.com/office/drawing/2015/9/8/chartex" xmlns:cx2="http://schemas.microsoft.com/office/drawing/2015/10/21/chartex" xmlns:cx3="http://schemas.microsoft.com/office/drawing/2016/5/9/chartex" xmlns:cx4="http://schemas.microsoft.com/office/drawing/2016/5/10/chartex" xmlns:cx5="http://schemas.microsoft.com/office/drawing/2016/5/11/chartex" xmlns:cx6="http://schemas.microsoft.com/office/drawing/2016/5/12/chartex" xmlns:cx7="http://schemas.microsoft.com/office/drawing/2016/5/13/chartex" xmlns:cx8="http://schemas.microsoft.com/office/drawing/2016/5/14/chartex" xmlns:mc="http://schemas.openxmlformats.org/markup-compatibility/2006" xmlns:aink="http://schemas.microsoft.com/office/drawing/2016/ink" xmlns:am3d="http://schemas.microsoft.com/office/drawing/2017/model3d" xmlns:o="urn:schemas-microsoft-com:office:office" xmlns:oel="http://schemas.microsoft.com/office/2019/extlst" xmlns:r="http://schemas.openxmlformats.org/officeDocument/2006/relationships" xmlns:m="http://schemas.openxmlformats.org/officeDocument/2006/math" xmlns:v="urn:schemas-microsoft-com:vml" xmlns:wp14="http://schemas.microsoft.com/office/word/2010/wordprocessingDrawing" xmlns:wp="http://schemas.openxmlformats.org/drawingml/2006/wordprocessingDrawing" xmlns:w10="urn:schemas-microsoft-com:office:word" xmlns:w="http://schemas.openxmlformats.org/wordprocessingml/2006/main" xmlns:w14="http://schemas.microsoft.com/office/word/2010/wordml" xmlns:w15="http://schemas.microsoft.com/office/word/2012/wordml" xmlns:w16cex="http://schemas.microsoft.com/office/word/2018/wordml/cex" xmlns:w16cid="http://schemas.microsoft.com/office/word/2016/wordml/cid" xmlns:w16="http://schemas.microsoft.com/office/word/2018/wordml" xmlns:w16du="http://schemas.microsoft.com/office/word/2023/wordml/word16du" xmlns:w16sdtdh="http://schemas.microsoft.com/office/word/2020/wordml/sdtdatahash" xmlns:w16se="http://schemas.microsoft.com/office/word/2015/wordml/symex" xmlns:wpg="http://schemas.microsoft.com/office/word/2010/wordprocessingGroup" xmlns:wpi="http://schemas.microsoft.com/office/word/2010/wordprocessingInk" xmlns:wne="http://schemas.microsoft.com/office/word/2006/wordml" xmlns:wps="http://schemas.microsoft.com/office/word/2010/wordprocessingShape" mc:Ignorable="w14 w15 w16se w16cid w16 w16cex w16sdtdh w16du wp14">
+  <w:endnote w:type="separator" w:id="-1">
     <w:p>
       <w:r>
         <w:separator/>
       </w:r>
     </w:p>
   </w:endnote>
-  <w:endnote w:type="continuationSeparator" w:id="1">
+  <w:endnote w:type="continuationSeparator" w:id="0">
     <w:p>
       <w:r>
         <w:continuationSeparator/>
@@ -34758,15 +34789,15 @@
 </file>
 
 <file path=word/footnotes.xml><?xml version="1.0" encoding="utf-8"?>
-<w:footnotes xmlns:ve="http://schemas.openxmlformats.org/markup-compatibility/2006" xmlns:o="urn:schemas-microsoft-com:office:office" xmlns:r="http://schemas.openxmlformats.org/officeDocument/2006/relationships" xmlns:m="http://schemas.openxmlformats.org/officeDocument/2006/math" xmlns:v="urn:schemas-microsoft-com:vml" xmlns:wp="http://schemas.openxmlformats.org/drawingml/2006/wordprocessingDrawing" xmlns:w10="urn:schemas-microsoft-com:office:word" xmlns:w="http://schemas.openxmlformats.org/wordprocessingml/2006/main" xmlns:wne="http://schemas.microsoft.com/office/word/2006/wordml">
-  <w:footnote w:type="separator" w:id="0">
+<w:footnotes xmlns:wpc="http://schemas.microsoft.com/office/word/2010/wordprocessingCanvas" xmlns:cx="http://schemas.microsoft.com/office/drawing/2014/chartex" xmlns:cx1="http://schemas.microsoft.com/office/drawing/2015/9/8/chartex" xmlns:cx2="http://schemas.microsoft.com/office/drawing/2015/10/21/chartex" xmlns:cx3="http://schemas.microsoft.com/office/drawing/2016/5/9/chartex" xmlns:cx4="http://schemas.microsoft.com/office/drawing/2016/5/10/chartex" xmlns:cx5="http://schemas.microsoft.com/office/drawing/2016/5/11/chartex" xmlns:cx6="http://schemas.microsoft.com/office/drawing/2016/5/12/chartex" xmlns:cx7="http://schemas.microsoft.com/office/drawing/2016/5/13/chartex" xmlns:cx8="http://schemas.microsoft.com/office/drawing/2016/5/14/chartex" xmlns:mc="http://schemas.openxmlformats.org/markup-compatibility/2006" xmlns:aink="http://schemas.microsoft.com/office/drawing/2016/ink" xmlns:am3d="http://schemas.microsoft.com/office/drawing/2017/model3d" xmlns:o="urn:schemas-microsoft-com:office:office" xmlns:oel="http://schemas.microsoft.com/office/2019/extlst" xmlns:r="http://schemas.openxmlformats.org/officeDocument/2006/relationships" xmlns:m="http://schemas.openxmlformats.org/officeDocument/2006/math" xmlns:v="urn:schemas-microsoft-com:vml" xmlns:wp14="http://schemas.microsoft.com/office/word/2010/wordprocessingDrawing" xmlns:wp="http://schemas.openxmlformats.org/drawingml/2006/wordprocessingDrawing" xmlns:w10="urn:schemas-microsoft-com:office:word" xmlns:w="http://schemas.openxmlformats.org/wordprocessingml/2006/main" xmlns:w14="http://schemas.microsoft.com/office/word/2010/wordml" xmlns:w15="http://schemas.microsoft.com/office/word/2012/wordml" xmlns:w16cex="http://schemas.microsoft.com/office/word/2018/wordml/cex" xmlns:w16cid="http://schemas.microsoft.com/office/word/2016/wordml/cid" xmlns:w16="http://schemas.microsoft.com/office/word/2018/wordml" xmlns:w16du="http://schemas.microsoft.com/office/word/2023/wordml/word16du" xmlns:w16sdtdh="http://schemas.microsoft.com/office/word/2020/wordml/sdtdatahash" xmlns:w16se="http://schemas.microsoft.com/office/word/2015/wordml/symex" xmlns:wpg="http://schemas.microsoft.com/office/word/2010/wordprocessingGroup" xmlns:wpi="http://schemas.microsoft.com/office/word/2010/wordprocessingInk" xmlns:wne="http://schemas.microsoft.com/office/word/2006/wordml" xmlns:wps="http://schemas.microsoft.com/office/word/2010/wordprocessingShape" mc:Ignorable="w14 w15 w16se w16cid w16 w16cex w16sdtdh w16du wp14">
+  <w:footnote w:type="separator" w:id="-1">
     <w:p>
       <w:r>
         <w:separator/>
       </w:r>
     </w:p>
   </w:footnote>
-  <w:footnote w:type="continuationSeparator" w:id="1">
+  <w:footnote w:type="continuationSeparator" w:id="0">
     <w:p>
       <w:r>
         <w:continuationSeparator/>
@@ -34777,28 +34808,41 @@
 </file>
 
 <file path=word/header1.xml><?xml version="1.0" encoding="utf-8"?>
-<w:hdr xmlns:ve="http://schemas.openxmlformats.org/markup-compatibility/2006" xmlns:o="urn:schemas-microsoft-com:office:office" xmlns:r="http://schemas.openxmlformats.org/officeDocument/2006/relationships" xmlns:m="http://schemas.openxmlformats.org/officeDocument/2006/math" xmlns:v="urn:schemas-microsoft-com:vml" xmlns:wp="http://schemas.openxmlformats.org/drawingml/2006/wordprocessingDrawing" xmlns:w10="urn:schemas-microsoft-com:office:word" xmlns:w="http://schemas.openxmlformats.org/wordprocessingml/2006/main" xmlns:wne="http://schemas.microsoft.com/office/word/2006/wordml">
+<w:hdr xmlns:wpc="http://schemas.microsoft.com/office/word/2010/wordprocessingCanvas" xmlns:cx="http://schemas.microsoft.com/office/drawing/2014/chartex" xmlns:cx1="http://schemas.microsoft.com/office/drawing/2015/9/8/chartex" xmlns:cx2="http://schemas.microsoft.com/office/drawing/2015/10/21/chartex" xmlns:cx3="http://schemas.microsoft.com/office/drawing/2016/5/9/chartex" xmlns:cx4="http://schemas.microsoft.com/office/drawing/2016/5/10/chartex" xmlns:cx5="http://schemas.microsoft.com/office/drawing/2016/5/11/chartex" xmlns:cx6="http://schemas.microsoft.com/office/drawing/2016/5/12/chartex" xmlns:cx7="http://schemas.microsoft.com/office/drawing/2016/5/13/chartex" xmlns:cx8="http://schemas.microsoft.com/office/drawing/2016/5/14/chartex" xmlns:mc="http://schemas.openxmlformats.org/markup-compatibility/2006" xmlns:aink="http://schemas.microsoft.com/office/drawing/2016/ink" xmlns:am3d="http://schemas.microsoft.com/office/drawing/2017/model3d" xmlns:o="urn:schemas-microsoft-com:office:office" xmlns:oel="http://schemas.microsoft.com/office/2019/extlst" xmlns:r="http://schemas.openxmlformats.org/officeDocument/2006/relationships" xmlns:m="http://schemas.openxmlformats.org/officeDocument/2006/math" xmlns:v="urn:schemas-microsoft-com:vml" xmlns:wp14="http://schemas.microsoft.com/office/word/2010/wordprocessingDrawing" xmlns:wp="http://schemas.openxmlformats.org/drawingml/2006/wordprocessingDrawing" xmlns:w10="urn:schemas-microsoft-com:office:word" xmlns:w="http://schemas.openxmlformats.org/wordprocessingml/2006/main" xmlns:w14="http://schemas.microsoft.com/office/word/2010/wordml" xmlns:w15="http://schemas.microsoft.com/office/word/2012/wordml" xmlns:w16cex="http://schemas.microsoft.com/office/word/2018/wordml/cex" xmlns:w16cid="http://schemas.microsoft.com/office/word/2016/wordml/cid" xmlns:w16="http://schemas.microsoft.com/office/word/2018/wordml" xmlns:w16du="http://schemas.microsoft.com/office/word/2023/wordml/word16du" xmlns:w16sdtdh="http://schemas.microsoft.com/office/word/2020/wordml/sdtdatahash" xmlns:w16se="http://schemas.microsoft.com/office/word/2015/wordml/symex" xmlns:wpg="http://schemas.microsoft.com/office/word/2010/wordprocessingGroup" xmlns:wpi="http://schemas.microsoft.com/office/word/2010/wordprocessingInk" xmlns:wne="http://schemas.microsoft.com/office/word/2006/wordml" xmlns:wps="http://schemas.microsoft.com/office/word/2010/wordprocessingShape" mc:Ignorable="w14 w15 w16se w16cid w16 w16cex w16sdtdh w16du wp14">
   <w:p>
     <w:pPr>
       <w:pStyle w:val="a4"/>
       <w:jc w:val="center"/>
     </w:pPr>
-    <w:fldSimple w:instr=" PAGE   \* MERGEFORMAT ">
-      <w:r>
-        <w:rPr>
-          <w:noProof/>
-        </w:rPr>
-        <w:t>2</w:t>
-      </w:r>
-    </w:fldSimple>
+    <w:r>
+      <w:fldChar w:fldCharType="begin"/>
+    </w:r>
+    <w:r>
+      <w:instrText xml:space="preserve"> PAGE   \* MERGEFORMAT </w:instrText>
+    </w:r>
+    <w:r>
+      <w:fldChar w:fldCharType="separate"/>
+    </w:r>
+    <w:r>
+      <w:rPr>
+        <w:noProof/>
+      </w:rPr>
+      <w:t>2</w:t>
+    </w:r>
+    <w:r>
+      <w:rPr>
+        <w:noProof/>
+      </w:rPr>
+      <w:fldChar w:fldCharType="end"/>
+    </w:r>
   </w:p>
   <w:p/>
 </w:hdr>
 </file>
 
 <file path=word/numbering.xml><?xml version="1.0" encoding="utf-8"?>
-<w:numbering xmlns:ve="http://schemas.openxmlformats.org/markup-compatibility/2006" xmlns:o="urn:schemas-microsoft-com:office:office" xmlns:r="http://schemas.openxmlformats.org/officeDocument/2006/relationships" xmlns:m="http://schemas.openxmlformats.org/officeDocument/2006/math" xmlns:v="urn:schemas-microsoft-com:vml" xmlns:wp="http://schemas.openxmlformats.org/drawingml/2006/wordprocessingDrawing" xmlns:w10="urn:schemas-microsoft-com:office:word" xmlns:w="http://schemas.openxmlformats.org/wordprocessingml/2006/main" xmlns:wne="http://schemas.microsoft.com/office/word/2006/wordml">
-  <w:abstractNum w:abstractNumId="0">
+<w:numbering xmlns:wpc="http://schemas.microsoft.com/office/word/2010/wordprocessingCanvas" xmlns:cx="http://schemas.microsoft.com/office/drawing/2014/chartex" xmlns:cx1="http://schemas.microsoft.com/office/drawing/2015/9/8/chartex" xmlns:cx2="http://schemas.microsoft.com/office/drawing/2015/10/21/chartex" xmlns:cx3="http://schemas.microsoft.com/office/drawing/2016/5/9/chartex" xmlns:cx4="http://schemas.microsoft.com/office/drawing/2016/5/10/chartex" xmlns:cx5="http://schemas.microsoft.com/office/drawing/2016/5/11/chartex" xmlns:cx6="http://schemas.microsoft.com/office/drawing/2016/5/12/chartex" xmlns:cx7="http://schemas.microsoft.com/office/drawing/2016/5/13/chartex" xmlns:cx8="http://schemas.microsoft.com/office/drawing/2016/5/14/chartex" xmlns:mc="http://schemas.openxmlformats.org/markup-compatibility/2006" xmlns:aink="http://schemas.microsoft.com/office/drawing/2016/ink" xmlns:am3d="http://schemas.microsoft.com/office/drawing/2017/model3d" xmlns:o="urn:schemas-microsoft-com:office:office" xmlns:oel="http://schemas.microsoft.com/office/2019/extlst" xmlns:r="http://schemas.openxmlformats.org/officeDocument/2006/relationships" xmlns:m="http://schemas.openxmlformats.org/officeDocument/2006/math" xmlns:v="urn:schemas-microsoft-com:vml" xmlns:wp14="http://schemas.microsoft.com/office/word/2010/wordprocessingDrawing" xmlns:wp="http://schemas.openxmlformats.org/drawingml/2006/wordprocessingDrawing" xmlns:w10="urn:schemas-microsoft-com:office:word" xmlns:w="http://schemas.openxmlformats.org/wordprocessingml/2006/main" xmlns:w14="http://schemas.microsoft.com/office/word/2010/wordml" xmlns:w15="http://schemas.microsoft.com/office/word/2012/wordml" xmlns:w16cex="http://schemas.microsoft.com/office/word/2018/wordml/cex" xmlns:w16cid="http://schemas.microsoft.com/office/word/2016/wordml/cid" xmlns:w16="http://schemas.microsoft.com/office/word/2018/wordml" xmlns:w16du="http://schemas.microsoft.com/office/word/2023/wordml/word16du" xmlns:w16sdtdh="http://schemas.microsoft.com/office/word/2020/wordml/sdtdatahash" xmlns:w16se="http://schemas.microsoft.com/office/word/2015/wordml/symex" xmlns:wpg="http://schemas.microsoft.com/office/word/2010/wordprocessingGroup" xmlns:wpi="http://schemas.microsoft.com/office/word/2010/wordprocessingInk" xmlns:wne="http://schemas.microsoft.com/office/word/2006/wordml" xmlns:wps="http://schemas.microsoft.com/office/word/2010/wordprocessingShape" mc:Ignorable="w14 w15 w16se w16cid w16 w16cex w16sdtdh w16du wp14">
+  <w:abstractNum w:abstractNumId="0" w15:restartNumberingAfterBreak="0">
     <w:nsid w:val="FFFFFF82"/>
     <w:multiLevelType w:val="singleLevel"/>
     <w:tmpl w:val="53DC8504"/>
@@ -34818,7 +34862,7 @@
       </w:rPr>
     </w:lvl>
   </w:abstractNum>
-  <w:abstractNum w:abstractNumId="1">
+  <w:abstractNum w:abstractNumId="1" w15:restartNumberingAfterBreak="0">
     <w:nsid w:val="FFFFFFFE"/>
     <w:multiLevelType w:val="singleLevel"/>
     <w:tmpl w:val="FFFFFFFF"/>
@@ -34828,7 +34872,7 @@
       <w:lvlJc w:val="left"/>
     </w:lvl>
   </w:abstractNum>
-  <w:abstractNum w:abstractNumId="2">
+  <w:abstractNum w:abstractNumId="2" w15:restartNumberingAfterBreak="0">
     <w:nsid w:val="07C674AF"/>
     <w:multiLevelType w:val="singleLevel"/>
     <w:tmpl w:val="9EFC9614"/>
@@ -34849,7 +34893,7 @@
       </w:rPr>
     </w:lvl>
   </w:abstractNum>
-  <w:abstractNum w:abstractNumId="3">
+  <w:abstractNum w:abstractNumId="3" w15:restartNumberingAfterBreak="0">
     <w:nsid w:val="0A2B3245"/>
     <w:multiLevelType w:val="singleLevel"/>
     <w:tmpl w:val="0419000F"/>
@@ -34866,7 +34910,7 @@
       </w:pPr>
     </w:lvl>
   </w:abstractNum>
-  <w:abstractNum w:abstractNumId="4">
+  <w:abstractNum w:abstractNumId="4" w15:restartNumberingAfterBreak="0">
     <w:nsid w:val="0A3A0F40"/>
     <w:multiLevelType w:val="singleLevel"/>
     <w:tmpl w:val="04190005"/>
@@ -34886,7 +34930,7 @@
       </w:rPr>
     </w:lvl>
   </w:abstractNum>
-  <w:abstractNum w:abstractNumId="5">
+  <w:abstractNum w:abstractNumId="5" w15:restartNumberingAfterBreak="0">
     <w:nsid w:val="0C333F1A"/>
     <w:multiLevelType w:val="singleLevel"/>
     <w:tmpl w:val="9030242C"/>
@@ -34906,7 +34950,7 @@
       </w:rPr>
     </w:lvl>
   </w:abstractNum>
-  <w:abstractNum w:abstractNumId="6">
+  <w:abstractNum w:abstractNumId="6" w15:restartNumberingAfterBreak="0">
     <w:nsid w:val="0C5F49AD"/>
     <w:multiLevelType w:val="singleLevel"/>
     <w:tmpl w:val="49DA99DE"/>
@@ -34921,7 +34965,7 @@
       </w:pPr>
     </w:lvl>
   </w:abstractNum>
-  <w:abstractNum w:abstractNumId="7">
+  <w:abstractNum w:abstractNumId="7" w15:restartNumberingAfterBreak="0">
     <w:nsid w:val="0CE731CA"/>
     <w:multiLevelType w:val="hybridMultilevel"/>
     <w:tmpl w:val="CF36E964"/>
@@ -35010,7 +35054,7 @@
       </w:pPr>
     </w:lvl>
   </w:abstractNum>
-  <w:abstractNum w:abstractNumId="8">
+  <w:abstractNum w:abstractNumId="8" w15:restartNumberingAfterBreak="0">
     <w:nsid w:val="0E533DD3"/>
     <w:multiLevelType w:val="singleLevel"/>
     <w:tmpl w:val="14846F5A"/>
@@ -35029,7 +35073,7 @@
       </w:rPr>
     </w:lvl>
   </w:abstractNum>
-  <w:abstractNum w:abstractNumId="9">
+  <w:abstractNum w:abstractNumId="9" w15:restartNumberingAfterBreak="0">
     <w:nsid w:val="0EF7520B"/>
     <w:multiLevelType w:val="singleLevel"/>
     <w:tmpl w:val="0419000F"/>
@@ -35046,7 +35090,7 @@
       </w:pPr>
     </w:lvl>
   </w:abstractNum>
-  <w:abstractNum w:abstractNumId="10">
+  <w:abstractNum w:abstractNumId="10" w15:restartNumberingAfterBreak="0">
     <w:nsid w:val="10622A5A"/>
     <w:multiLevelType w:val="singleLevel"/>
     <w:tmpl w:val="FA9494E0"/>
@@ -35066,7 +35110,7 @@
       </w:rPr>
     </w:lvl>
   </w:abstractNum>
-  <w:abstractNum w:abstractNumId="11">
+  <w:abstractNum w:abstractNumId="11" w15:restartNumberingAfterBreak="0">
     <w:nsid w:val="10844479"/>
     <w:multiLevelType w:val="singleLevel"/>
     <w:tmpl w:val="63D2EDA2"/>
@@ -35086,7 +35130,7 @@
       </w:rPr>
     </w:lvl>
   </w:abstractNum>
-  <w:abstractNum w:abstractNumId="12">
+  <w:abstractNum w:abstractNumId="12" w15:restartNumberingAfterBreak="0">
     <w:nsid w:val="12BC6F26"/>
     <w:multiLevelType w:val="singleLevel"/>
     <w:tmpl w:val="2F2CF052"/>
@@ -35106,7 +35150,7 @@
       </w:rPr>
     </w:lvl>
   </w:abstractNum>
-  <w:abstractNum w:abstractNumId="13">
+  <w:abstractNum w:abstractNumId="13" w15:restartNumberingAfterBreak="0">
     <w:nsid w:val="12EF09D3"/>
     <w:multiLevelType w:val="singleLevel"/>
     <w:tmpl w:val="04190001"/>
@@ -35126,7 +35170,7 @@
       </w:rPr>
     </w:lvl>
   </w:abstractNum>
-  <w:abstractNum w:abstractNumId="14">
+  <w:abstractNum w:abstractNumId="14" w15:restartNumberingAfterBreak="0">
     <w:nsid w:val="18202B0A"/>
     <w:multiLevelType w:val="singleLevel"/>
     <w:tmpl w:val="FA9494E0"/>
@@ -35146,7 +35190,7 @@
       </w:rPr>
     </w:lvl>
   </w:abstractNum>
-  <w:abstractNum w:abstractNumId="15">
+  <w:abstractNum w:abstractNumId="15" w15:restartNumberingAfterBreak="0">
     <w:nsid w:val="19CD0B18"/>
     <w:multiLevelType w:val="singleLevel"/>
     <w:tmpl w:val="8056E254"/>
@@ -35166,7 +35210,7 @@
       </w:rPr>
     </w:lvl>
   </w:abstractNum>
-  <w:abstractNum w:abstractNumId="16">
+  <w:abstractNum w:abstractNumId="16" w15:restartNumberingAfterBreak="0">
     <w:nsid w:val="1BAA7375"/>
     <w:multiLevelType w:val="singleLevel"/>
     <w:tmpl w:val="E9561EC0"/>
@@ -35186,7 +35230,7 @@
       </w:rPr>
     </w:lvl>
   </w:abstractNum>
-  <w:abstractNum w:abstractNumId="17">
+  <w:abstractNum w:abstractNumId="17" w15:restartNumberingAfterBreak="0">
     <w:nsid w:val="1D2307E2"/>
     <w:multiLevelType w:val="singleLevel"/>
     <w:tmpl w:val="0419000F"/>
@@ -35203,7 +35247,7 @@
       </w:pPr>
     </w:lvl>
   </w:abstractNum>
-  <w:abstractNum w:abstractNumId="18">
+  <w:abstractNum w:abstractNumId="18" w15:restartNumberingAfterBreak="0">
     <w:nsid w:val="2CC95687"/>
     <w:multiLevelType w:val="singleLevel"/>
     <w:tmpl w:val="7B1423E4"/>
@@ -35223,7 +35267,7 @@
       </w:rPr>
     </w:lvl>
   </w:abstractNum>
-  <w:abstractNum w:abstractNumId="19">
+  <w:abstractNum w:abstractNumId="19" w15:restartNumberingAfterBreak="0">
     <w:nsid w:val="2F0F034E"/>
     <w:multiLevelType w:val="hybridMultilevel"/>
     <w:tmpl w:val="0EE2332E"/>
@@ -35365,7 +35409,7 @@
       </w:rPr>
     </w:lvl>
   </w:abstractNum>
-  <w:abstractNum w:abstractNumId="20">
+  <w:abstractNum w:abstractNumId="20" w15:restartNumberingAfterBreak="0">
     <w:nsid w:val="2F4E6F19"/>
     <w:multiLevelType w:val="hybridMultilevel"/>
     <w:tmpl w:val="B21C5B60"/>
@@ -35481,7 +35525,7 @@
       </w:pPr>
     </w:lvl>
   </w:abstractNum>
-  <w:abstractNum w:abstractNumId="21">
+  <w:abstractNum w:abstractNumId="21" w15:restartNumberingAfterBreak="0">
     <w:nsid w:val="2F5E6310"/>
     <w:multiLevelType w:val="singleLevel"/>
     <w:tmpl w:val="04190001"/>
@@ -35501,7 +35545,7 @@
       </w:rPr>
     </w:lvl>
   </w:abstractNum>
-  <w:abstractNum w:abstractNumId="22">
+  <w:abstractNum w:abstractNumId="22" w15:restartNumberingAfterBreak="0">
     <w:nsid w:val="336A385B"/>
     <w:multiLevelType w:val="singleLevel"/>
     <w:tmpl w:val="04190001"/>
@@ -35521,7 +35565,7 @@
       </w:rPr>
     </w:lvl>
   </w:abstractNum>
-  <w:abstractNum w:abstractNumId="23">
+  <w:abstractNum w:abstractNumId="23" w15:restartNumberingAfterBreak="0">
     <w:nsid w:val="34D16931"/>
     <w:multiLevelType w:val="singleLevel"/>
     <w:tmpl w:val="1540B376"/>
@@ -35541,7 +35585,7 @@
       </w:rPr>
     </w:lvl>
   </w:abstractNum>
-  <w:abstractNum w:abstractNumId="24">
+  <w:abstractNum w:abstractNumId="24" w15:restartNumberingAfterBreak="0">
     <w:nsid w:val="3605150D"/>
     <w:multiLevelType w:val="singleLevel"/>
     <w:tmpl w:val="04190001"/>
@@ -35561,7 +35605,7 @@
       </w:rPr>
     </w:lvl>
   </w:abstractNum>
-  <w:abstractNum w:abstractNumId="25">
+  <w:abstractNum w:abstractNumId="25" w15:restartNumberingAfterBreak="0">
     <w:nsid w:val="363F4A9D"/>
     <w:multiLevelType w:val="singleLevel"/>
     <w:tmpl w:val="55DC5EC2"/>
@@ -35581,7 +35625,7 @@
       </w:rPr>
     </w:lvl>
   </w:abstractNum>
-  <w:abstractNum w:abstractNumId="26">
+  <w:abstractNum w:abstractNumId="26" w15:restartNumberingAfterBreak="0">
     <w:nsid w:val="370B5281"/>
     <w:multiLevelType w:val="singleLevel"/>
     <w:tmpl w:val="0419000F"/>
@@ -35598,7 +35642,7 @@
       </w:pPr>
     </w:lvl>
   </w:abstractNum>
-  <w:abstractNum w:abstractNumId="27">
+  <w:abstractNum w:abstractNumId="27" w15:restartNumberingAfterBreak="0">
     <w:nsid w:val="3DBC1945"/>
     <w:multiLevelType w:val="singleLevel"/>
     <w:tmpl w:val="C122AF9C"/>
@@ -35618,7 +35662,7 @@
       </w:rPr>
     </w:lvl>
   </w:abstractNum>
-  <w:abstractNum w:abstractNumId="28">
+  <w:abstractNum w:abstractNumId="28" w15:restartNumberingAfterBreak="0">
     <w:nsid w:val="3F4031C8"/>
     <w:multiLevelType w:val="singleLevel"/>
     <w:tmpl w:val="15E44C0C"/>
@@ -35638,7 +35682,7 @@
       </w:rPr>
     </w:lvl>
   </w:abstractNum>
-  <w:abstractNum w:abstractNumId="29">
+  <w:abstractNum w:abstractNumId="29" w15:restartNumberingAfterBreak="0">
     <w:nsid w:val="417E331B"/>
     <w:multiLevelType w:val="singleLevel"/>
     <w:tmpl w:val="0419000F"/>
@@ -35655,7 +35699,7 @@
       </w:pPr>
     </w:lvl>
   </w:abstractNum>
-  <w:abstractNum w:abstractNumId="30">
+  <w:abstractNum w:abstractNumId="30" w15:restartNumberingAfterBreak="0">
     <w:nsid w:val="418A155F"/>
     <w:multiLevelType w:val="singleLevel"/>
     <w:tmpl w:val="3C50573C"/>
@@ -35676,7 +35720,7 @@
       </w:rPr>
     </w:lvl>
   </w:abstractNum>
-  <w:abstractNum w:abstractNumId="31">
+  <w:abstractNum w:abstractNumId="31" w15:restartNumberingAfterBreak="0">
     <w:nsid w:val="4CA92FFD"/>
     <w:multiLevelType w:val="singleLevel"/>
     <w:tmpl w:val="4D4E2550"/>
@@ -35696,7 +35740,7 @@
       </w:rPr>
     </w:lvl>
   </w:abstractNum>
-  <w:abstractNum w:abstractNumId="32">
+  <w:abstractNum w:abstractNumId="32" w15:restartNumberingAfterBreak="0">
     <w:nsid w:val="51E924C7"/>
     <w:multiLevelType w:val="singleLevel"/>
     <w:tmpl w:val="63D2EDA2"/>
@@ -35716,7 +35760,7 @@
       </w:rPr>
     </w:lvl>
   </w:abstractNum>
-  <w:abstractNum w:abstractNumId="33">
+  <w:abstractNum w:abstractNumId="33" w15:restartNumberingAfterBreak="0">
     <w:nsid w:val="5A8F6DDC"/>
     <w:multiLevelType w:val="singleLevel"/>
     <w:tmpl w:val="FA9494E0"/>
@@ -35736,7 +35780,7 @@
       </w:rPr>
     </w:lvl>
   </w:abstractNum>
-  <w:abstractNum w:abstractNumId="34">
+  <w:abstractNum w:abstractNumId="34" w15:restartNumberingAfterBreak="0">
     <w:nsid w:val="5D985A24"/>
     <w:multiLevelType w:val="singleLevel"/>
     <w:tmpl w:val="FA9494E0"/>
@@ -35756,7 +35800,7 @@
       </w:rPr>
     </w:lvl>
   </w:abstractNum>
-  <w:abstractNum w:abstractNumId="35">
+  <w:abstractNum w:abstractNumId="35" w15:restartNumberingAfterBreak="0">
     <w:nsid w:val="62994CC3"/>
     <w:multiLevelType w:val="singleLevel"/>
     <w:tmpl w:val="04190001"/>
@@ -35776,7 +35820,7 @@
       </w:rPr>
     </w:lvl>
   </w:abstractNum>
-  <w:abstractNum w:abstractNumId="36">
+  <w:abstractNum w:abstractNumId="36" w15:restartNumberingAfterBreak="0">
     <w:nsid w:val="630638A2"/>
     <w:multiLevelType w:val="singleLevel"/>
     <w:tmpl w:val="D2D49AB0"/>
@@ -35795,7 +35839,7 @@
       </w:rPr>
     </w:lvl>
   </w:abstractNum>
-  <w:abstractNum w:abstractNumId="37">
+  <w:abstractNum w:abstractNumId="37" w15:restartNumberingAfterBreak="0">
     <w:nsid w:val="6CD61CD8"/>
     <w:multiLevelType w:val="singleLevel"/>
     <w:tmpl w:val="88B89796"/>
@@ -35815,7 +35859,7 @@
       </w:rPr>
     </w:lvl>
   </w:abstractNum>
-  <w:abstractNum w:abstractNumId="38">
+  <w:abstractNum w:abstractNumId="38" w15:restartNumberingAfterBreak="0">
     <w:nsid w:val="6EDD769F"/>
     <w:multiLevelType w:val="singleLevel"/>
     <w:tmpl w:val="E9561EC0"/>
@@ -35835,7 +35879,7 @@
       </w:rPr>
     </w:lvl>
   </w:abstractNum>
-  <w:abstractNum w:abstractNumId="39">
+  <w:abstractNum w:abstractNumId="39" w15:restartNumberingAfterBreak="0">
     <w:nsid w:val="6EDE1958"/>
     <w:multiLevelType w:val="singleLevel"/>
     <w:tmpl w:val="F61889B6"/>
@@ -35855,7 +35899,7 @@
       </w:rPr>
     </w:lvl>
   </w:abstractNum>
-  <w:abstractNum w:abstractNumId="40">
+  <w:abstractNum w:abstractNumId="40" w15:restartNumberingAfterBreak="0">
     <w:nsid w:val="71E40B3E"/>
     <w:multiLevelType w:val="multilevel"/>
     <w:tmpl w:val="FBB84B7E"/>
@@ -35995,7 +36039,7 @@
       </w:rPr>
     </w:lvl>
   </w:abstractNum>
-  <w:abstractNum w:abstractNumId="41">
+  <w:abstractNum w:abstractNumId="41" w15:restartNumberingAfterBreak="0">
     <w:nsid w:val="7BA37564"/>
     <w:multiLevelType w:val="singleLevel"/>
     <w:tmpl w:val="0419000F"/>
@@ -36012,7 +36056,7 @@
       </w:pPr>
     </w:lvl>
   </w:abstractNum>
-  <w:abstractNum w:abstractNumId="42">
+  <w:abstractNum w:abstractNumId="42" w15:restartNumberingAfterBreak="0">
     <w:nsid w:val="7BB065B6"/>
     <w:multiLevelType w:val="singleLevel"/>
     <w:tmpl w:val="7E06108E"/>
@@ -36033,10 +36077,10 @@
       </w:rPr>
     </w:lvl>
   </w:abstractNum>
-  <w:num w:numId="1">
+  <w:num w:numId="1" w16cid:durableId="1169639506">
     <w:abstractNumId w:val="6"/>
   </w:num>
-  <w:num w:numId="2">
+  <w:num w:numId="2" w16cid:durableId="986475194">
     <w:abstractNumId w:val="1"/>
     <w:lvlOverride w:ilvl="0">
       <w:lvl w:ilvl="0">
@@ -36051,134 +36095,134 @@
       </w:lvl>
     </w:lvlOverride>
   </w:num>
-  <w:num w:numId="3">
+  <w:num w:numId="3" w16cid:durableId="1832911291">
     <w:abstractNumId w:val="13"/>
   </w:num>
-  <w:num w:numId="4">
+  <w:num w:numId="4" w16cid:durableId="148837606">
     <w:abstractNumId w:val="10"/>
   </w:num>
-  <w:num w:numId="5">
+  <w:num w:numId="5" w16cid:durableId="784231884">
     <w:abstractNumId w:val="26"/>
   </w:num>
-  <w:num w:numId="6">
+  <w:num w:numId="6" w16cid:durableId="2125690110">
     <w:abstractNumId w:val="38"/>
   </w:num>
-  <w:num w:numId="7">
+  <w:num w:numId="7" w16cid:durableId="762607440">
     <w:abstractNumId w:val="16"/>
   </w:num>
-  <w:num w:numId="8">
+  <w:num w:numId="8" w16cid:durableId="2089224110">
     <w:abstractNumId w:val="21"/>
   </w:num>
-  <w:num w:numId="9">
+  <w:num w:numId="9" w16cid:durableId="584463067">
     <w:abstractNumId w:val="14"/>
   </w:num>
-  <w:num w:numId="10">
+  <w:num w:numId="10" w16cid:durableId="1585720559">
     <w:abstractNumId w:val="34"/>
   </w:num>
-  <w:num w:numId="11">
+  <w:num w:numId="11" w16cid:durableId="661468639">
     <w:abstractNumId w:val="33"/>
   </w:num>
-  <w:num w:numId="12">
+  <w:num w:numId="12" w16cid:durableId="1276670362">
     <w:abstractNumId w:val="25"/>
   </w:num>
-  <w:num w:numId="13">
+  <w:num w:numId="13" w16cid:durableId="1320963437">
     <w:abstractNumId w:val="31"/>
   </w:num>
-  <w:num w:numId="14">
+  <w:num w:numId="14" w16cid:durableId="1843930925">
     <w:abstractNumId w:val="37"/>
   </w:num>
-  <w:num w:numId="15">
+  <w:num w:numId="15" w16cid:durableId="563219315">
     <w:abstractNumId w:val="39"/>
   </w:num>
-  <w:num w:numId="16">
+  <w:num w:numId="16" w16cid:durableId="368140369">
     <w:abstractNumId w:val="12"/>
   </w:num>
-  <w:num w:numId="17">
+  <w:num w:numId="17" w16cid:durableId="1162550994">
     <w:abstractNumId w:val="4"/>
   </w:num>
-  <w:num w:numId="18">
+  <w:num w:numId="18" w16cid:durableId="1651403110">
     <w:abstractNumId w:val="41"/>
   </w:num>
-  <w:num w:numId="19">
+  <w:num w:numId="19" w16cid:durableId="582419422">
     <w:abstractNumId w:val="29"/>
   </w:num>
-  <w:num w:numId="20">
+  <w:num w:numId="20" w16cid:durableId="2009672709">
     <w:abstractNumId w:val="40"/>
   </w:num>
-  <w:num w:numId="21">
+  <w:num w:numId="21" w16cid:durableId="644823052">
     <w:abstractNumId w:val="35"/>
   </w:num>
-  <w:num w:numId="22">
+  <w:num w:numId="22" w16cid:durableId="504786738">
     <w:abstractNumId w:val="17"/>
   </w:num>
-  <w:num w:numId="23">
+  <w:num w:numId="23" w16cid:durableId="197202611">
     <w:abstractNumId w:val="9"/>
   </w:num>
-  <w:num w:numId="24">
+  <w:num w:numId="24" w16cid:durableId="1930307100">
     <w:abstractNumId w:val="30"/>
   </w:num>
-  <w:num w:numId="25">
+  <w:num w:numId="25" w16cid:durableId="1190798786">
     <w:abstractNumId w:val="42"/>
   </w:num>
-  <w:num w:numId="26">
+  <w:num w:numId="26" w16cid:durableId="1972519250">
     <w:abstractNumId w:val="24"/>
   </w:num>
-  <w:num w:numId="27">
+  <w:num w:numId="27" w16cid:durableId="1332176217">
     <w:abstractNumId w:val="2"/>
   </w:num>
-  <w:num w:numId="28">
+  <w:num w:numId="28" w16cid:durableId="910504548">
     <w:abstractNumId w:val="22"/>
   </w:num>
-  <w:num w:numId="29">
+  <w:num w:numId="29" w16cid:durableId="53283295">
     <w:abstractNumId w:val="5"/>
   </w:num>
-  <w:num w:numId="30">
+  <w:num w:numId="30" w16cid:durableId="289168090">
     <w:abstractNumId w:val="23"/>
   </w:num>
-  <w:num w:numId="31">
+  <w:num w:numId="31" w16cid:durableId="2080322844">
     <w:abstractNumId w:val="32"/>
   </w:num>
-  <w:num w:numId="32">
+  <w:num w:numId="32" w16cid:durableId="644700065">
     <w:abstractNumId w:val="11"/>
   </w:num>
-  <w:num w:numId="33">
+  <w:num w:numId="33" w16cid:durableId="1086456989">
     <w:abstractNumId w:val="0"/>
   </w:num>
-  <w:num w:numId="34">
+  <w:num w:numId="34" w16cid:durableId="493958716">
     <w:abstractNumId w:val="27"/>
   </w:num>
-  <w:num w:numId="35">
+  <w:num w:numId="35" w16cid:durableId="386690208">
     <w:abstractNumId w:val="15"/>
   </w:num>
-  <w:num w:numId="36">
+  <w:num w:numId="36" w16cid:durableId="936987489">
     <w:abstractNumId w:val="8"/>
   </w:num>
-  <w:num w:numId="37">
+  <w:num w:numId="37" w16cid:durableId="410322443">
     <w:abstractNumId w:val="36"/>
   </w:num>
-  <w:num w:numId="38">
+  <w:num w:numId="38" w16cid:durableId="1556162652">
     <w:abstractNumId w:val="3"/>
   </w:num>
-  <w:num w:numId="39">
+  <w:num w:numId="39" w16cid:durableId="1872380675">
     <w:abstractNumId w:val="18"/>
   </w:num>
-  <w:num w:numId="40">
+  <w:num w:numId="40" w16cid:durableId="12808274">
     <w:abstractNumId w:val="28"/>
   </w:num>
-  <w:num w:numId="41">
+  <w:num w:numId="41" w16cid:durableId="251280637">
     <w:abstractNumId w:val="19"/>
   </w:num>
-  <w:num w:numId="42">
+  <w:num w:numId="42" w16cid:durableId="1441099773">
     <w:abstractNumId w:val="20"/>
   </w:num>
-  <w:num w:numId="43">
+  <w:num w:numId="43" w16cid:durableId="1388147873">
     <w:abstractNumId w:val="7"/>
   </w:num>
 </w:numbering>
 </file>
 
 <file path=word/styles.xml><?xml version="1.0" encoding="utf-8"?>
-<w:styles xmlns:r="http://schemas.openxmlformats.org/officeDocument/2006/relationships" xmlns:w="http://schemas.openxmlformats.org/wordprocessingml/2006/main">
+<w:styles xmlns:mc="http://schemas.openxmlformats.org/markup-compatibility/2006" xmlns:r="http://schemas.openxmlformats.org/officeDocument/2006/relationships" xmlns:w="http://schemas.openxmlformats.org/wordprocessingml/2006/main" xmlns:w14="http://schemas.microsoft.com/office/word/2010/wordml" xmlns:w15="http://schemas.microsoft.com/office/word/2012/wordml" xmlns:w16cex="http://schemas.microsoft.com/office/word/2018/wordml/cex" xmlns:w16cid="http://schemas.microsoft.com/office/word/2016/wordml/cid" xmlns:w16="http://schemas.microsoft.com/office/word/2018/wordml" xmlns:w16du="http://schemas.microsoft.com/office/word/2023/wordml/word16du" xmlns:w16sdtdh="http://schemas.microsoft.com/office/word/2020/wordml/sdtdatahash" xmlns:w16se="http://schemas.microsoft.com/office/word/2015/wordml/symex" mc:Ignorable="w14 w15 w16se w16cid w16 w16cex w16sdtdh w16du">
   <w:docDefaults>
     <w:rPrDefault>
       <w:rPr>
@@ -36188,146 +36232,383 @@
     </w:rPrDefault>
     <w:pPrDefault/>
   </w:docDefaults>
-  <w:latentStyles w:defLockedState="0" w:defUIPriority="99" w:defSemiHidden="1" w:defUnhideWhenUsed="1" w:defQFormat="0" w:count="267">
-    <w:lsdException w:name="Normal" w:semiHidden="0" w:uiPriority="0" w:unhideWhenUsed="0" w:qFormat="1"/>
-    <w:lsdException w:name="heading 1" w:semiHidden="0" w:uiPriority="9" w:unhideWhenUsed="0" w:qFormat="1"/>
-    <w:lsdException w:name="heading 2" w:semiHidden="0" w:uiPriority="9" w:unhideWhenUsed="0" w:qFormat="1"/>
-    <w:lsdException w:name="heading 3" w:uiPriority="9" w:qFormat="1"/>
-    <w:lsdException w:name="heading 4" w:semiHidden="0" w:uiPriority="0" w:unhideWhenUsed="0" w:qFormat="1"/>
-    <w:lsdException w:name="heading 5" w:uiPriority="9" w:qFormat="1"/>
-    <w:lsdException w:name="heading 6" w:uiPriority="9" w:qFormat="1"/>
-    <w:lsdException w:name="heading 7" w:uiPriority="9" w:qFormat="1"/>
-    <w:lsdException w:name="heading 8" w:uiPriority="9" w:qFormat="1"/>
-    <w:lsdException w:name="heading 9" w:uiPriority="9" w:qFormat="1"/>
-    <w:lsdException w:name="toc 1" w:uiPriority="39"/>
-    <w:lsdException w:name="toc 2" w:uiPriority="39"/>
-    <w:lsdException w:name="toc 3" w:uiPriority="39"/>
-    <w:lsdException w:name="toc 4" w:uiPriority="39"/>
-    <w:lsdException w:name="toc 5" w:uiPriority="39"/>
-    <w:lsdException w:name="toc 6" w:uiPriority="39"/>
-    <w:lsdException w:name="toc 7" w:uiPriority="39"/>
-    <w:lsdException w:name="toc 8" w:uiPriority="39"/>
-    <w:lsdException w:name="toc 9" w:uiPriority="39"/>
-    <w:lsdException w:name="caption" w:uiPriority="35" w:qFormat="1"/>
-    <w:lsdException w:name="Title" w:semiHidden="0" w:uiPriority="10" w:unhideWhenUsed="0" w:qFormat="1"/>
-    <w:lsdException w:name="Default Paragraph Font" w:uiPriority="1"/>
-    <w:lsdException w:name="Body Text" w:uiPriority="0"/>
-    <w:lsdException w:name="Body Text Indent" w:uiPriority="0"/>
-    <w:lsdException w:name="Subtitle" w:semiHidden="0" w:uiPriority="11" w:unhideWhenUsed="0" w:qFormat="1"/>
-    <w:lsdException w:name="Strong" w:semiHidden="0" w:uiPriority="22" w:unhideWhenUsed="0" w:qFormat="1"/>
-    <w:lsdException w:name="Emphasis" w:semiHidden="0" w:uiPriority="20" w:unhideWhenUsed="0" w:qFormat="1"/>
-    <w:lsdException w:name="Table Grid" w:semiHidden="0" w:uiPriority="59" w:unhideWhenUsed="0"/>
-    <w:lsdException w:name="Placeholder Text" w:unhideWhenUsed="0"/>
-    <w:lsdException w:name="No Spacing" w:semiHidden="0" w:uiPriority="1" w:unhideWhenUsed="0" w:qFormat="1"/>
-    <w:lsdException w:name="Light Shading" w:semiHidden="0" w:uiPriority="60" w:unhideWhenUsed="0"/>
-    <w:lsdException w:name="Light List" w:semiHidden="0" w:uiPriority="61" w:unhideWhenUsed="0"/>
-    <w:lsdException w:name="Light Grid" w:semiHidden="0" w:uiPriority="62" w:unhideWhenUsed="0"/>
-    <w:lsdException w:name="Medium Shading 1" w:semiHidden="0" w:uiPriority="63" w:unhideWhenUsed="0"/>
-    <w:lsdException w:name="Medium Shading 2" w:semiHidden="0" w:uiPriority="64" w:unhideWhenUsed="0"/>
-    <w:lsdException w:name="Medium List 1" w:semiHidden="0" w:uiPriority="65" w:unhideWhenUsed="0"/>
-    <w:lsdException w:name="Medium List 2" w:semiHidden="0" w:uiPriority="66" w:unhideWhenUsed="0"/>
-    <w:lsdException w:name="Medium Grid 1" w:semiHidden="0" w:uiPriority="67" w:unhideWhenUsed="0"/>
-    <w:lsdException w:name="Medium Grid 2" w:semiHidden="0" w:uiPriority="68" w:unhideWhenUsed="0"/>
-    <w:lsdException w:name="Medium Grid 3" w:semiHidden="0" w:uiPriority="69" w:unhideWhenUsed="0"/>
-    <w:lsdException w:name="Dark List" w:semiHidden="0" w:uiPriority="70" w:unhideWhenUsed="0"/>
-    <w:lsdException w:name="Colorful Shading" w:semiHidden="0" w:uiPriority="71" w:unhideWhenUsed="0"/>
-    <w:lsdException w:name="Colorful List" w:semiHidden="0" w:uiPriority="72" w:unhideWhenUsed="0"/>
-    <w:lsdException w:name="Colorful Grid" w:semiHidden="0" w:uiPriority="73" w:unhideWhenUsed="0"/>
-    <w:lsdException w:name="Light Shading Accent 1" w:semiHidden="0" w:uiPriority="60" w:unhideWhenUsed="0"/>
-    <w:lsdException w:name="Light List Accent 1" w:semiHidden="0" w:uiPriority="61" w:unhideWhenUsed="0"/>
-    <w:lsdException w:name="Light Grid Accent 1" w:semiHidden="0" w:uiPriority="62" w:unhideWhenUsed="0"/>
-    <w:lsdException w:name="Medium Shading 1 Accent 1" w:semiHidden="0" w:uiPriority="63" w:unhideWhenUsed="0"/>
-    <w:lsdException w:name="Medium Shading 2 Accent 1" w:semiHidden="0" w:uiPriority="64" w:unhideWhenUsed="0"/>
-    <w:lsdException w:name="Medium List 1 Accent 1" w:semiHidden="0" w:uiPriority="65" w:unhideWhenUsed="0"/>
-    <w:lsdException w:name="Revision" w:unhideWhenUsed="0"/>
-    <w:lsdException w:name="List Paragraph" w:semiHidden="0" w:uiPriority="34" w:unhideWhenUsed="0" w:qFormat="1"/>
-    <w:lsdException w:name="Quote" w:semiHidden="0" w:uiPriority="29" w:unhideWhenUsed="0" w:qFormat="1"/>
-    <w:lsdException w:name="Intense Quote" w:semiHidden="0" w:uiPriority="30" w:unhideWhenUsed="0" w:qFormat="1"/>
-    <w:lsdException w:name="Medium List 2 Accent 1" w:semiHidden="0" w:uiPriority="66" w:unhideWhenUsed="0"/>
-    <w:lsdException w:name="Medium Grid 1 Accent 1" w:semiHidden="0" w:uiPriority="67" w:unhideWhenUsed="0"/>
-    <w:lsdException w:name="Medium Grid 2 Accent 1" w:semiHidden="0" w:uiPriority="68" w:unhideWhenUsed="0"/>
-    <w:lsdException w:name="Medium Grid 3 Accent 1" w:semiHidden="0" w:uiPriority="69" w:unhideWhenUsed="0"/>
-    <w:lsdException w:name="Dark List Accent 1" w:semiHidden="0" w:uiPriority="70" w:unhideWhenUsed="0"/>
-    <w:lsdException w:name="Colorful Shading Accent 1" w:semiHidden="0" w:uiPriority="71" w:unhideWhenUsed="0"/>
-    <w:lsdException w:name="Colorful List Accent 1" w:semiHidden="0" w:uiPriority="72" w:unhideWhenUsed="0"/>
-    <w:lsdException w:name="Colorful Grid Accent 1" w:semiHidden="0" w:uiPriority="73" w:unhideWhenUsed="0"/>
-    <w:lsdException w:name="Light Shading Accent 2" w:semiHidden="0" w:uiPriority="60" w:unhideWhenUsed="0"/>
-    <w:lsdException w:name="Light List Accent 2" w:semiHidden="0" w:uiPriority="61" w:unhideWhenUsed="0"/>
-    <w:lsdException w:name="Light Grid Accent 2" w:semiHidden="0" w:uiPriority="62" w:unhideWhenUsed="0"/>
-    <w:lsdException w:name="Medium Shading 1 Accent 2" w:semiHidden="0" w:uiPriority="63" w:unhideWhenUsed="0"/>
-    <w:lsdException w:name="Medium Shading 2 Accent 2" w:semiHidden="0" w:uiPriority="64" w:unhideWhenUsed="0"/>
-    <w:lsdException w:name="Medium List 1 Accent 2" w:semiHidden="0" w:uiPriority="65" w:unhideWhenUsed="0"/>
-    <w:lsdException w:name="Medium List 2 Accent 2" w:semiHidden="0" w:uiPriority="66" w:unhideWhenUsed="0"/>
-    <w:lsdException w:name="Medium Grid 1 Accent 2" w:semiHidden="0" w:uiPriority="67" w:unhideWhenUsed="0"/>
-    <w:lsdException w:name="Medium Grid 2 Accent 2" w:semiHidden="0" w:uiPriority="68" w:unhideWhenUsed="0"/>
-    <w:lsdException w:name="Medium Grid 3 Accent 2" w:semiHidden="0" w:uiPriority="69" w:unhideWhenUsed="0"/>
-    <w:lsdException w:name="Dark List Accent 2" w:semiHidden="0" w:uiPriority="70" w:unhideWhenUsed="0"/>
-    <w:lsdException w:name="Colorful Shading Accent 2" w:semiHidden="0" w:uiPriority="71" w:unhideWhenUsed="0"/>
-    <w:lsdException w:name="Colorful List Accent 2" w:semiHidden="0" w:uiPriority="72" w:unhideWhenUsed="0"/>
-    <w:lsdException w:name="Colorful Grid Accent 2" w:semiHidden="0" w:uiPriority="73" w:unhideWhenUsed="0"/>
-    <w:lsdException w:name="Light Shading Accent 3" w:semiHidden="0" w:uiPriority="60" w:unhideWhenUsed="0"/>
-    <w:lsdException w:name="Light List Accent 3" w:semiHidden="0" w:uiPriority="61" w:unhideWhenUsed="0"/>
-    <w:lsdException w:name="Light Grid Accent 3" w:semiHidden="0" w:uiPriority="62" w:unhideWhenUsed="0"/>
-    <w:lsdException w:name="Medium Shading 1 Accent 3" w:semiHidden="0" w:uiPriority="63" w:unhideWhenUsed="0"/>
-    <w:lsdException w:name="Medium Shading 2 Accent 3" w:semiHidden="0" w:uiPriority="64" w:unhideWhenUsed="0"/>
-    <w:lsdException w:name="Medium List 1 Accent 3" w:semiHidden="0" w:uiPriority="65" w:unhideWhenUsed="0"/>
-    <w:lsdException w:name="Medium List 2 Accent 3" w:semiHidden="0" w:uiPriority="66" w:unhideWhenUsed="0"/>
-    <w:lsdException w:name="Medium Grid 1 Accent 3" w:semiHidden="0" w:uiPriority="67" w:unhideWhenUsed="0"/>
-    <w:lsdException w:name="Medium Grid 2 Accent 3" w:semiHidden="0" w:uiPriority="68" w:unhideWhenUsed="0"/>
-    <w:lsdException w:name="Medium Grid 3 Accent 3" w:semiHidden="0" w:uiPriority="69" w:unhideWhenUsed="0"/>
-    <w:lsdException w:name="Dark List Accent 3" w:semiHidden="0" w:uiPriority="70" w:unhideWhenUsed="0"/>
-    <w:lsdException w:name="Colorful Shading Accent 3" w:semiHidden="0" w:uiPriority="71" w:unhideWhenUsed="0"/>
-    <w:lsdException w:name="Colorful List Accent 3" w:semiHidden="0" w:uiPriority="72" w:unhideWhenUsed="0"/>
-    <w:lsdException w:name="Colorful Grid Accent 3" w:semiHidden="0" w:uiPriority="73" w:unhideWhenUsed="0"/>
-    <w:lsdException w:name="Light Shading Accent 4" w:semiHidden="0" w:uiPriority="60" w:unhideWhenUsed="0"/>
-    <w:lsdException w:name="Light List Accent 4" w:semiHidden="0" w:uiPriority="61" w:unhideWhenUsed="0"/>
-    <w:lsdException w:name="Light Grid Accent 4" w:semiHidden="0" w:uiPriority="62" w:unhideWhenUsed="0"/>
-    <w:lsdException w:name="Medium Shading 1 Accent 4" w:semiHidden="0" w:uiPriority="63" w:unhideWhenUsed="0"/>
-    <w:lsdException w:name="Medium Shading 2 Accent 4" w:semiHidden="0" w:uiPriority="64" w:unhideWhenUsed="0"/>
-    <w:lsdException w:name="Medium List 1 Accent 4" w:semiHidden="0" w:uiPriority="65" w:unhideWhenUsed="0"/>
-    <w:lsdException w:name="Medium List 2 Accent 4" w:semiHidden="0" w:uiPriority="66" w:unhideWhenUsed="0"/>
-    <w:lsdException w:name="Medium Grid 1 Accent 4" w:semiHidden="0" w:uiPriority="67" w:unhideWhenUsed="0"/>
-    <w:lsdException w:name="Medium Grid 2 Accent 4" w:semiHidden="0" w:uiPriority="68" w:unhideWhenUsed="0"/>
-    <w:lsdException w:name="Medium Grid 3 Accent 4" w:semiHidden="0" w:uiPriority="69" w:unhideWhenUsed="0"/>
-    <w:lsdException w:name="Dark List Accent 4" w:semiHidden="0" w:uiPriority="70" w:unhideWhenUsed="0"/>
-    <w:lsdException w:name="Colorful Shading Accent 4" w:semiHidden="0" w:uiPriority="71" w:unhideWhenUsed="0"/>
-    <w:lsdException w:name="Colorful List Accent 4" w:semiHidden="0" w:uiPriority="72" w:unhideWhenUsed="0"/>
-    <w:lsdException w:name="Colorful Grid Accent 4" w:semiHidden="0" w:uiPriority="73" w:unhideWhenUsed="0"/>
-    <w:lsdException w:name="Light Shading Accent 5" w:semiHidden="0" w:uiPriority="60" w:unhideWhenUsed="0"/>
-    <w:lsdException w:name="Light List Accent 5" w:semiHidden="0" w:uiPriority="61" w:unhideWhenUsed="0"/>
-    <w:lsdException w:name="Light Grid Accent 5" w:semiHidden="0" w:uiPriority="62" w:unhideWhenUsed="0"/>
-    <w:lsdException w:name="Medium Shading 1 Accent 5" w:semiHidden="0" w:uiPriority="63" w:unhideWhenUsed="0"/>
-    <w:lsdException w:name="Medium Shading 2 Accent 5" w:semiHidden="0" w:uiPriority="64" w:unhideWhenUsed="0"/>
-    <w:lsdException w:name="Medium List 1 Accent 5" w:semiHidden="0" w:uiPriority="65" w:unhideWhenUsed="0"/>
-    <w:lsdException w:name="Medium List 2 Accent 5" w:semiHidden="0" w:uiPriority="66" w:unhideWhenUsed="0"/>
-    <w:lsdException w:name="Medium Grid 1 Accent 5" w:semiHidden="0" w:uiPriority="67" w:unhideWhenUsed="0"/>
-    <w:lsdException w:name="Medium Grid 2 Accent 5" w:semiHidden="0" w:uiPriority="68" w:unhideWhenUsed="0"/>
-    <w:lsdException w:name="Medium Grid 3 Accent 5" w:semiHidden="0" w:uiPriority="69" w:unhideWhenUsed="0"/>
-    <w:lsdException w:name="Dark List Accent 5" w:semiHidden="0" w:uiPriority="70" w:unhideWhenUsed="0"/>
-    <w:lsdException w:name="Colorful Shading Accent 5" w:semiHidden="0" w:uiPriority="71" w:unhideWhenUsed="0"/>
-    <w:lsdException w:name="Colorful List Accent 5" w:semiHidden="0" w:uiPriority="72" w:unhideWhenUsed="0"/>
-    <w:lsdException w:name="Colorful Grid Accent 5" w:semiHidden="0" w:uiPriority="73" w:unhideWhenUsed="0"/>
-    <w:lsdException w:name="Light Shading Accent 6" w:semiHidden="0" w:uiPriority="60" w:unhideWhenUsed="0"/>
-    <w:lsdException w:name="Light List Accent 6" w:semiHidden="0" w:uiPriority="61" w:unhideWhenUsed="0"/>
-    <w:lsdException w:name="Light Grid Accent 6" w:semiHidden="0" w:uiPriority="62" w:unhideWhenUsed="0"/>
-    <w:lsdException w:name="Medium Shading 1 Accent 6" w:semiHidden="0" w:uiPriority="63" w:unhideWhenUsed="0"/>
-    <w:lsdException w:name="Medium Shading 2 Accent 6" w:semiHidden="0" w:uiPriority="64" w:unhideWhenUsed="0"/>
-    <w:lsdException w:name="Medium List 1 Accent 6" w:semiHidden="0" w:uiPriority="65" w:unhideWhenUsed="0"/>
-    <w:lsdException w:name="Medium List 2 Accent 6" w:semiHidden="0" w:uiPriority="66" w:unhideWhenUsed="0"/>
-    <w:lsdException w:name="Medium Grid 1 Accent 6" w:semiHidden="0" w:uiPriority="67" w:unhideWhenUsed="0"/>
-    <w:lsdException w:name="Medium Grid 2 Accent 6" w:semiHidden="0" w:uiPriority="68" w:unhideWhenUsed="0"/>
-    <w:lsdException w:name="Medium Grid 3 Accent 6" w:semiHidden="0" w:uiPriority="69" w:unhideWhenUsed="0"/>
-    <w:lsdException w:name="Dark List Accent 6" w:semiHidden="0" w:uiPriority="70" w:unhideWhenUsed="0"/>
-    <w:lsdException w:name="Colorful Shading Accent 6" w:semiHidden="0" w:uiPriority="71" w:unhideWhenUsed="0"/>
-    <w:lsdException w:name="Colorful List Accent 6" w:semiHidden="0" w:uiPriority="72" w:unhideWhenUsed="0"/>
-    <w:lsdException w:name="Colorful Grid Accent 6" w:semiHidden="0" w:uiPriority="73" w:unhideWhenUsed="0"/>
-    <w:lsdException w:name="Subtle Emphasis" w:semiHidden="0" w:uiPriority="19" w:unhideWhenUsed="0" w:qFormat="1"/>
-    <w:lsdException w:name="Intense Emphasis" w:semiHidden="0" w:uiPriority="21" w:unhideWhenUsed="0" w:qFormat="1"/>
-    <w:lsdException w:name="Subtle Reference" w:semiHidden="0" w:uiPriority="31" w:unhideWhenUsed="0" w:qFormat="1"/>
-    <w:lsdException w:name="Intense Reference" w:semiHidden="0" w:uiPriority="32" w:unhideWhenUsed="0" w:qFormat="1"/>
-    <w:lsdException w:name="Book Title" w:semiHidden="0" w:uiPriority="33" w:unhideWhenUsed="0" w:qFormat="1"/>
-    <w:lsdException w:name="Bibliography" w:uiPriority="37"/>
-    <w:lsdException w:name="TOC Heading" w:uiPriority="39" w:qFormat="1"/>
+  <w:latentStyles w:defLockedState="0" w:defUIPriority="99" w:defSemiHidden="0" w:defUnhideWhenUsed="0" w:defQFormat="0" w:count="376">
+    <w:lsdException w:name="Normal" w:uiPriority="0" w:qFormat="1"/>
+    <w:lsdException w:name="heading 1" w:uiPriority="9" w:qFormat="1"/>
+    <w:lsdException w:name="heading 2" w:uiPriority="9" w:qFormat="1"/>
+    <w:lsdException w:name="heading 3" w:semiHidden="1" w:uiPriority="9" w:unhideWhenUsed="1" w:qFormat="1"/>
+    <w:lsdException w:name="heading 4" w:uiPriority="0" w:qFormat="1"/>
+    <w:lsdException w:name="heading 5" w:semiHidden="1" w:uiPriority="9" w:unhideWhenUsed="1" w:qFormat="1"/>
+    <w:lsdException w:name="heading 6" w:semiHidden="1" w:uiPriority="9" w:unhideWhenUsed="1" w:qFormat="1"/>
+    <w:lsdException w:name="heading 7" w:semiHidden="1" w:uiPriority="9" w:unhideWhenUsed="1" w:qFormat="1"/>
+    <w:lsdException w:name="heading 8" w:semiHidden="1" w:uiPriority="9" w:unhideWhenUsed="1" w:qFormat="1"/>
+    <w:lsdException w:name="heading 9" w:semiHidden="1" w:uiPriority="9" w:unhideWhenUsed="1" w:qFormat="1"/>
+    <w:lsdException w:name="index 1" w:semiHidden="1" w:unhideWhenUsed="1"/>
+    <w:lsdException w:name="index 2" w:semiHidden="1" w:unhideWhenUsed="1"/>
+    <w:lsdException w:name="index 3" w:semiHidden="1" w:unhideWhenUsed="1"/>
+    <w:lsdException w:name="index 4" w:semiHidden="1" w:unhideWhenUsed="1"/>
+    <w:lsdException w:name="index 5" w:semiHidden="1" w:unhideWhenUsed="1"/>
+    <w:lsdException w:name="index 6" w:semiHidden="1" w:unhideWhenUsed="1"/>
+    <w:lsdException w:name="index 7" w:semiHidden="1" w:unhideWhenUsed="1"/>
+    <w:lsdException w:name="index 8" w:semiHidden="1" w:unhideWhenUsed="1"/>
+    <w:lsdException w:name="index 9" w:semiHidden="1" w:unhideWhenUsed="1"/>
+    <w:lsdException w:name="toc 1" w:semiHidden="1" w:uiPriority="39" w:unhideWhenUsed="1"/>
+    <w:lsdException w:name="toc 2" w:semiHidden="1" w:uiPriority="39" w:unhideWhenUsed="1"/>
+    <w:lsdException w:name="toc 3" w:semiHidden="1" w:uiPriority="39" w:unhideWhenUsed="1"/>
+    <w:lsdException w:name="toc 4" w:semiHidden="1" w:uiPriority="39" w:unhideWhenUsed="1"/>
+    <w:lsdException w:name="toc 5" w:semiHidden="1" w:uiPriority="39" w:unhideWhenUsed="1"/>
+    <w:lsdException w:name="toc 6" w:semiHidden="1" w:uiPriority="39" w:unhideWhenUsed="1"/>
+    <w:lsdException w:name="toc 7" w:semiHidden="1" w:uiPriority="39" w:unhideWhenUsed="1"/>
+    <w:lsdException w:name="toc 8" w:semiHidden="1" w:uiPriority="39" w:unhideWhenUsed="1"/>
+    <w:lsdException w:name="toc 9" w:semiHidden="1" w:uiPriority="39" w:unhideWhenUsed="1"/>
+    <w:lsdException w:name="Normal Indent" w:semiHidden="1" w:unhideWhenUsed="1"/>
+    <w:lsdException w:name="footnote text" w:semiHidden="1" w:unhideWhenUsed="1"/>
+    <w:lsdException w:name="annotation text" w:semiHidden="1" w:unhideWhenUsed="1"/>
+    <w:lsdException w:name="header" w:semiHidden="1" w:unhideWhenUsed="1"/>
+    <w:lsdException w:name="footer" w:semiHidden="1" w:unhideWhenUsed="1"/>
+    <w:lsdException w:name="index heading" w:semiHidden="1" w:unhideWhenUsed="1"/>
+    <w:lsdException w:name="caption" w:semiHidden="1" w:uiPriority="35" w:unhideWhenUsed="1" w:qFormat="1"/>
+    <w:lsdException w:name="table of figures" w:semiHidden="1" w:unhideWhenUsed="1"/>
+    <w:lsdException w:name="envelope address" w:semiHidden="1" w:unhideWhenUsed="1"/>
+    <w:lsdException w:name="envelope return" w:semiHidden="1" w:unhideWhenUsed="1"/>
+    <w:lsdException w:name="footnote reference" w:semiHidden="1" w:unhideWhenUsed="1"/>
+    <w:lsdException w:name="annotation reference" w:semiHidden="1" w:unhideWhenUsed="1"/>
+    <w:lsdException w:name="line number" w:semiHidden="1" w:unhideWhenUsed="1"/>
+    <w:lsdException w:name="page number" w:semiHidden="1" w:unhideWhenUsed="1"/>
+    <w:lsdException w:name="endnote reference" w:semiHidden="1" w:unhideWhenUsed="1"/>
+    <w:lsdException w:name="endnote text" w:semiHidden="1" w:unhideWhenUsed="1"/>
+    <w:lsdException w:name="table of authorities" w:semiHidden="1" w:unhideWhenUsed="1"/>
+    <w:lsdException w:name="macro" w:semiHidden="1" w:unhideWhenUsed="1"/>
+    <w:lsdException w:name="toa heading" w:semiHidden="1" w:unhideWhenUsed="1"/>
+    <w:lsdException w:name="List" w:semiHidden="1" w:unhideWhenUsed="1"/>
+    <w:lsdException w:name="List Bullet" w:semiHidden="1" w:unhideWhenUsed="1"/>
+    <w:lsdException w:name="List Number" w:semiHidden="1" w:unhideWhenUsed="1"/>
+    <w:lsdException w:name="List 2" w:semiHidden="1" w:unhideWhenUsed="1"/>
+    <w:lsdException w:name="List 3" w:semiHidden="1" w:unhideWhenUsed="1"/>
+    <w:lsdException w:name="List 4" w:semiHidden="1" w:unhideWhenUsed="1"/>
+    <w:lsdException w:name="List 5" w:semiHidden="1" w:unhideWhenUsed="1"/>
+    <w:lsdException w:name="List Bullet 2" w:semiHidden="1" w:unhideWhenUsed="1"/>
+    <w:lsdException w:name="List Bullet 3" w:semiHidden="1" w:unhideWhenUsed="1"/>
+    <w:lsdException w:name="List Bullet 4" w:semiHidden="1" w:unhideWhenUsed="1"/>
+    <w:lsdException w:name="List Bullet 5" w:semiHidden="1" w:unhideWhenUsed="1"/>
+    <w:lsdException w:name="List Number 2" w:semiHidden="1" w:unhideWhenUsed="1"/>
+    <w:lsdException w:name="List Number 3" w:semiHidden="1" w:unhideWhenUsed="1"/>
+    <w:lsdException w:name="List Number 4" w:semiHidden="1" w:unhideWhenUsed="1"/>
+    <w:lsdException w:name="List Number 5" w:semiHidden="1" w:unhideWhenUsed="1"/>
+    <w:lsdException w:name="Title" w:uiPriority="10" w:qFormat="1"/>
+    <w:lsdException w:name="Closing" w:semiHidden="1" w:unhideWhenUsed="1"/>
+    <w:lsdException w:name="Signature" w:semiHidden="1" w:unhideWhenUsed="1"/>
+    <w:lsdException w:name="Default Paragraph Font" w:semiHidden="1" w:uiPriority="1" w:unhideWhenUsed="1"/>
+    <w:lsdException w:name="Body Text" w:semiHidden="1" w:uiPriority="0" w:unhideWhenUsed="1"/>
+    <w:lsdException w:name="Body Text Indent" w:semiHidden="1" w:uiPriority="0" w:unhideWhenUsed="1"/>
+    <w:lsdException w:name="List Continue" w:semiHidden="1" w:unhideWhenUsed="1"/>
+    <w:lsdException w:name="List Continue 2" w:semiHidden="1" w:unhideWhenUsed="1"/>
+    <w:lsdException w:name="List Continue 3" w:semiHidden="1" w:unhideWhenUsed="1"/>
+    <w:lsdException w:name="List Continue 4" w:semiHidden="1" w:unhideWhenUsed="1"/>
+    <w:lsdException w:name="List Continue 5" w:semiHidden="1" w:unhideWhenUsed="1"/>
+    <w:lsdException w:name="Message Header" w:semiHidden="1" w:unhideWhenUsed="1"/>
+    <w:lsdException w:name="Subtitle" w:uiPriority="11" w:qFormat="1"/>
+    <w:lsdException w:name="Salutation" w:semiHidden="1" w:unhideWhenUsed="1"/>
+    <w:lsdException w:name="Date" w:semiHidden="1" w:unhideWhenUsed="1"/>
+    <w:lsdException w:name="Body Text First Indent" w:semiHidden="1" w:unhideWhenUsed="1"/>
+    <w:lsdException w:name="Body Text First Indent 2" w:semiHidden="1" w:unhideWhenUsed="1"/>
+    <w:lsdException w:name="Note Heading" w:semiHidden="1" w:unhideWhenUsed="1"/>
+    <w:lsdException w:name="Body Text 2" w:semiHidden="1" w:unhideWhenUsed="1"/>
+    <w:lsdException w:name="Body Text 3" w:semiHidden="1" w:unhideWhenUsed="1"/>
+    <w:lsdException w:name="Body Text Indent 2" w:semiHidden="1" w:unhideWhenUsed="1"/>
+    <w:lsdException w:name="Body Text Indent 3" w:semiHidden="1" w:unhideWhenUsed="1"/>
+    <w:lsdException w:name="Block Text" w:semiHidden="1" w:unhideWhenUsed="1"/>
+    <w:lsdException w:name="Hyperlink" w:semiHidden="1" w:unhideWhenUsed="1"/>
+    <w:lsdException w:name="FollowedHyperlink" w:semiHidden="1" w:unhideWhenUsed="1"/>
+    <w:lsdException w:name="Strong" w:uiPriority="22" w:qFormat="1"/>
+    <w:lsdException w:name="Emphasis" w:uiPriority="20" w:qFormat="1"/>
+    <w:lsdException w:name="Document Map" w:semiHidden="1" w:unhideWhenUsed="1"/>
+    <w:lsdException w:name="Plain Text" w:semiHidden="1" w:unhideWhenUsed="1"/>
+    <w:lsdException w:name="E-mail Signature" w:semiHidden="1" w:unhideWhenUsed="1"/>
+    <w:lsdException w:name="HTML Top of Form" w:semiHidden="1" w:unhideWhenUsed="1"/>
+    <w:lsdException w:name="HTML Bottom of Form" w:semiHidden="1" w:unhideWhenUsed="1"/>
+    <w:lsdException w:name="Normal (Web)" w:semiHidden="1" w:unhideWhenUsed="1"/>
+    <w:lsdException w:name="HTML Acronym" w:semiHidden="1" w:unhideWhenUsed="1"/>
+    <w:lsdException w:name="HTML Address" w:semiHidden="1" w:unhideWhenUsed="1"/>
+    <w:lsdException w:name="HTML Cite" w:semiHidden="1" w:unhideWhenUsed="1"/>
+    <w:lsdException w:name="HTML Code" w:semiHidden="1" w:unhideWhenUsed="1"/>
+    <w:lsdException w:name="HTML Definition" w:semiHidden="1" w:unhideWhenUsed="1"/>
+    <w:lsdException w:name="HTML Keyboard" w:semiHidden="1" w:unhideWhenUsed="1"/>
+    <w:lsdException w:name="HTML Preformatted" w:semiHidden="1" w:unhideWhenUsed="1"/>
+    <w:lsdException w:name="HTML Sample" w:semiHidden="1" w:unhideWhenUsed="1"/>
+    <w:lsdException w:name="HTML Typewriter" w:semiHidden="1" w:unhideWhenUsed="1"/>
+    <w:lsdException w:name="HTML Variable" w:semiHidden="1" w:unhideWhenUsed="1"/>
+    <w:lsdException w:name="Normal Table" w:semiHidden="1" w:unhideWhenUsed="1"/>
+    <w:lsdException w:name="annotation subject" w:semiHidden="1" w:unhideWhenUsed="1"/>
+    <w:lsdException w:name="No List" w:semiHidden="1" w:unhideWhenUsed="1"/>
+    <w:lsdException w:name="Outline List 1" w:semiHidden="1" w:unhideWhenUsed="1"/>
+    <w:lsdException w:name="Outline List 2" w:semiHidden="1" w:unhideWhenUsed="1"/>
+    <w:lsdException w:name="Outline List 3" w:semiHidden="1" w:unhideWhenUsed="1"/>
+    <w:lsdException w:name="Table Simple 1" w:semiHidden="1" w:unhideWhenUsed="1"/>
+    <w:lsdException w:name="Table Simple 2" w:semiHidden="1" w:unhideWhenUsed="1"/>
+    <w:lsdException w:name="Table Simple 3" w:semiHidden="1" w:unhideWhenUsed="1"/>
+    <w:lsdException w:name="Table Classic 1" w:semiHidden="1" w:unhideWhenUsed="1"/>
+    <w:lsdException w:name="Table Classic 2" w:semiHidden="1" w:unhideWhenUsed="1"/>
+    <w:lsdException w:name="Table Classic 3" w:semiHidden="1" w:unhideWhenUsed="1"/>
+    <w:lsdException w:name="Table Classic 4" w:semiHidden="1" w:unhideWhenUsed="1"/>
+    <w:lsdException w:name="Table Colorful 1" w:semiHidden="1" w:unhideWhenUsed="1"/>
+    <w:lsdException w:name="Table Colorful 2" w:semiHidden="1" w:unhideWhenUsed="1"/>
+    <w:lsdException w:name="Table Colorful 3" w:semiHidden="1" w:unhideWhenUsed="1"/>
+    <w:lsdException w:name="Table Columns 1" w:semiHidden="1" w:unhideWhenUsed="1"/>
+    <w:lsdException w:name="Table Columns 2" w:semiHidden="1" w:unhideWhenUsed="1"/>
+    <w:lsdException w:name="Table Columns 3" w:semiHidden="1" w:unhideWhenUsed="1"/>
+    <w:lsdException w:name="Table Columns 4" w:semiHidden="1" w:unhideWhenUsed="1"/>
+    <w:lsdException w:name="Table Columns 5" w:semiHidden="1" w:unhideWhenUsed="1"/>
+    <w:lsdException w:name="Table Grid 1" w:semiHidden="1" w:unhideWhenUsed="1"/>
+    <w:lsdException w:name="Table Grid 2" w:semiHidden="1" w:unhideWhenUsed="1"/>
+    <w:lsdException w:name="Table Grid 3" w:semiHidden="1" w:unhideWhenUsed="1"/>
+    <w:lsdException w:name="Table Grid 4" w:semiHidden="1" w:unhideWhenUsed="1"/>
+    <w:lsdException w:name="Table Grid 5" w:semiHidden="1" w:unhideWhenUsed="1"/>
+    <w:lsdException w:name="Table Grid 6" w:semiHidden="1" w:unhideWhenUsed="1"/>
+    <w:lsdException w:name="Table Grid 7" w:semiHidden="1" w:unhideWhenUsed="1"/>
+    <w:lsdException w:name="Table Grid 8" w:semiHidden="1" w:unhideWhenUsed="1"/>
+    <w:lsdException w:name="Table List 1" w:semiHidden="1" w:unhideWhenUsed="1"/>
+    <w:lsdException w:name="Table List 2" w:semiHidden="1" w:unhideWhenUsed="1"/>
+    <w:lsdException w:name="Table List 3" w:semiHidden="1" w:unhideWhenUsed="1"/>
+    <w:lsdException w:name="Table List 4" w:semiHidden="1" w:unhideWhenUsed="1"/>
+    <w:lsdException w:name="Table List 5" w:semiHidden="1" w:unhideWhenUsed="1"/>
+    <w:lsdException w:name="Table List 6" w:semiHidden="1" w:unhideWhenUsed="1"/>
+    <w:lsdException w:name="Table List 7" w:semiHidden="1" w:unhideWhenUsed="1"/>
+    <w:lsdException w:name="Table List 8" w:semiHidden="1" w:unhideWhenUsed="1"/>
+    <w:lsdException w:name="Table 3D effects 1" w:semiHidden="1" w:unhideWhenUsed="1"/>
+    <w:lsdException w:name="Table 3D effects 2" w:semiHidden="1" w:unhideWhenUsed="1"/>
+    <w:lsdException w:name="Table 3D effects 3" w:semiHidden="1" w:unhideWhenUsed="1"/>
+    <w:lsdException w:name="Table Contemporary" w:semiHidden="1" w:unhideWhenUsed="1"/>
+    <w:lsdException w:name="Table Elegant" w:semiHidden="1" w:unhideWhenUsed="1"/>
+    <w:lsdException w:name="Table Professional" w:semiHidden="1" w:unhideWhenUsed="1"/>
+    <w:lsdException w:name="Table Subtle 1" w:semiHidden="1" w:unhideWhenUsed="1"/>
+    <w:lsdException w:name="Table Subtle 2" w:semiHidden="1" w:unhideWhenUsed="1"/>
+    <w:lsdException w:name="Table Web 1" w:semiHidden="1" w:unhideWhenUsed="1"/>
+    <w:lsdException w:name="Table Web 2" w:semiHidden="1" w:unhideWhenUsed="1"/>
+    <w:lsdException w:name="Table Web 3" w:semiHidden="1" w:unhideWhenUsed="1"/>
+    <w:lsdException w:name="Balloon Text" w:semiHidden="1" w:unhideWhenUsed="1"/>
+    <w:lsdException w:name="Table Grid" w:uiPriority="59"/>
+    <w:lsdException w:name="Table Theme" w:semiHidden="1" w:unhideWhenUsed="1"/>
+    <w:lsdException w:name="Placeholder Text" w:semiHidden="1"/>
+    <w:lsdException w:name="No Spacing" w:uiPriority="1" w:qFormat="1"/>
+    <w:lsdException w:name="Light Shading" w:uiPriority="60"/>
+    <w:lsdException w:name="Light List" w:uiPriority="61"/>
+    <w:lsdException w:name="Light Grid" w:uiPriority="62"/>
+    <w:lsdException w:name="Medium Shading 1" w:uiPriority="63"/>
+    <w:lsdException w:name="Medium Shading 2" w:uiPriority="64"/>
+    <w:lsdException w:name="Medium List 1" w:uiPriority="65"/>
+    <w:lsdException w:name="Medium List 2" w:uiPriority="66"/>
+    <w:lsdException w:name="Medium Grid 1" w:uiPriority="67"/>
+    <w:lsdException w:name="Medium Grid 2" w:uiPriority="68"/>
+    <w:lsdException w:name="Medium Grid 3" w:uiPriority="69"/>
+    <w:lsdException w:name="Dark List" w:uiPriority="70"/>
+    <w:lsdException w:name="Colorful Shading" w:uiPriority="71"/>
+    <w:lsdException w:name="Colorful List" w:uiPriority="72"/>
+    <w:lsdException w:name="Colorful Grid" w:uiPriority="73"/>
+    <w:lsdException w:name="Light Shading Accent 1" w:uiPriority="60"/>
+    <w:lsdException w:name="Light List Accent 1" w:uiPriority="61"/>
+    <w:lsdException w:name="Light Grid Accent 1" w:uiPriority="62"/>
+    <w:lsdException w:name="Medium Shading 1 Accent 1" w:uiPriority="63"/>
+    <w:lsdException w:name="Medium Shading 2 Accent 1" w:uiPriority="64"/>
+    <w:lsdException w:name="Medium List 1 Accent 1" w:uiPriority="65"/>
+    <w:lsdException w:name="Revision" w:semiHidden="1"/>
+    <w:lsdException w:name="List Paragraph" w:uiPriority="34" w:qFormat="1"/>
+    <w:lsdException w:name="Quote" w:uiPriority="29" w:qFormat="1"/>
+    <w:lsdException w:name="Intense Quote" w:uiPriority="30" w:qFormat="1"/>
+    <w:lsdException w:name="Medium List 2 Accent 1" w:uiPriority="66"/>
+    <w:lsdException w:name="Medium Grid 1 Accent 1" w:uiPriority="67"/>
+    <w:lsdException w:name="Medium Grid 2 Accent 1" w:uiPriority="68"/>
+    <w:lsdException w:name="Medium Grid 3 Accent 1" w:uiPriority="69"/>
+    <w:lsdException w:name="Dark List Accent 1" w:uiPriority="70"/>
+    <w:lsdException w:name="Colorful Shading Accent 1" w:uiPriority="71"/>
+    <w:lsdException w:name="Colorful List Accent 1" w:uiPriority="72"/>
+    <w:lsdException w:name="Colorful Grid Accent 1" w:uiPriority="73"/>
+    <w:lsdException w:name="Light Shading Accent 2" w:uiPriority="60"/>
+    <w:lsdException w:name="Light List Accent 2" w:uiPriority="61"/>
+    <w:lsdException w:name="Light Grid Accent 2" w:uiPriority="62"/>
+    <w:lsdException w:name="Medium Shading 1 Accent 2" w:uiPriority="63"/>
+    <w:lsdException w:name="Medium Shading 2 Accent 2" w:uiPriority="64"/>
+    <w:lsdException w:name="Medium List 1 Accent 2" w:uiPriority="65"/>
+    <w:lsdException w:name="Medium List 2 Accent 2" w:uiPriority="66"/>
+    <w:lsdException w:name="Medium Grid 1 Accent 2" w:uiPriority="67"/>
+    <w:lsdException w:name="Medium Grid 2 Accent 2" w:uiPriority="68"/>
+    <w:lsdException w:name="Medium Grid 3 Accent 2" w:uiPriority="69"/>
+    <w:lsdException w:name="Dark List Accent 2" w:uiPriority="70"/>
+    <w:lsdException w:name="Colorful Shading Accent 2" w:uiPriority="71"/>
+    <w:lsdException w:name="Colorful List Accent 2" w:uiPriority="72"/>
+    <w:lsdException w:name="Colorful Grid Accent 2" w:uiPriority="73"/>
+    <w:lsdException w:name="Light Shading Accent 3" w:uiPriority="60"/>
+    <w:lsdException w:name="Light List Accent 3" w:uiPriority="61"/>
+    <w:lsdException w:name="Light Grid Accent 3" w:uiPriority="62"/>
+    <w:lsdException w:name="Medium Shading 1 Accent 3" w:uiPriority="63"/>
+    <w:lsdException w:name="Medium Shading 2 Accent 3" w:uiPriority="64"/>
+    <w:lsdException w:name="Medium List 1 Accent 3" w:uiPriority="65"/>
+    <w:lsdException w:name="Medium List 2 Accent 3" w:uiPriority="66"/>
+    <w:lsdException w:name="Medium Grid 1 Accent 3" w:uiPriority="67"/>
+    <w:lsdException w:name="Medium Grid 2 Accent 3" w:uiPriority="68"/>
+    <w:lsdException w:name="Medium Grid 3 Accent 3" w:uiPriority="69"/>
+    <w:lsdException w:name="Dark List Accent 3" w:uiPriority="70"/>
+    <w:lsdException w:name="Colorful Shading Accent 3" w:uiPriority="71"/>
+    <w:lsdException w:name="Colorful List Accent 3" w:uiPriority="72"/>
+    <w:lsdException w:name="Colorful Grid Accent 3" w:uiPriority="73"/>
+    <w:lsdException w:name="Light Shading Accent 4" w:uiPriority="60"/>
+    <w:lsdException w:name="Light List Accent 4" w:uiPriority="61"/>
+    <w:lsdException w:name="Light Grid Accent 4" w:uiPriority="62"/>
+    <w:lsdException w:name="Medium Shading 1 Accent 4" w:uiPriority="63"/>
+    <w:lsdException w:name="Medium Shading 2 Accent 4" w:uiPriority="64"/>
+    <w:lsdException w:name="Medium List 1 Accent 4" w:uiPriority="65"/>
+    <w:lsdException w:name="Medium List 2 Accent 4" w:uiPriority="66"/>
+    <w:lsdException w:name="Medium Grid 1 Accent 4" w:uiPriority="67"/>
+    <w:lsdException w:name="Medium Grid 2 Accent 4" w:uiPriority="68"/>
+    <w:lsdException w:name="Medium Grid 3 Accent 4" w:uiPriority="69"/>
+    <w:lsdException w:name="Dark List Accent 4" w:uiPriority="70"/>
+    <w:lsdException w:name="Colorful Shading Accent 4" w:uiPriority="71"/>
+    <w:lsdException w:name="Colorful List Accent 4" w:uiPriority="72"/>
+    <w:lsdException w:name="Colorful Grid Accent 4" w:uiPriority="73"/>
+    <w:lsdException w:name="Light Shading Accent 5" w:uiPriority="60"/>
+    <w:lsdException w:name="Light List Accent 5" w:uiPriority="61"/>
+    <w:lsdException w:name="Light Grid Accent 5" w:uiPriority="62"/>
+    <w:lsdException w:name="Medium Shading 1 Accent 5" w:uiPriority="63"/>
+    <w:lsdException w:name="Medium Shading 2 Accent 5" w:uiPriority="64"/>
+    <w:lsdException w:name="Medium List 1 Accent 5" w:uiPriority="65"/>
+    <w:lsdException w:name="Medium List 2 Accent 5" w:uiPriority="66"/>
+    <w:lsdException w:name="Medium Grid 1 Accent 5" w:uiPriority="67"/>
+    <w:lsdException w:name="Medium Grid 2 Accent 5" w:uiPriority="68"/>
+    <w:lsdException w:name="Medium Grid 3 Accent 5" w:uiPriority="69"/>
+    <w:lsdException w:name="Dark List Accent 5" w:uiPriority="70"/>
+    <w:lsdException w:name="Colorful Shading Accent 5" w:uiPriority="71"/>
+    <w:lsdException w:name="Colorful List Accent 5" w:uiPriority="72"/>
+    <w:lsdException w:name="Colorful Grid Accent 5" w:uiPriority="73"/>
+    <w:lsdException w:name="Light Shading Accent 6" w:uiPriority="60"/>
+    <w:lsdException w:name="Light List Accent 6" w:uiPriority="61"/>
+    <w:lsdException w:name="Light Grid Accent 6" w:uiPriority="62"/>
+    <w:lsdException w:name="Medium Shading 1 Accent 6" w:uiPriority="63"/>
+    <w:lsdException w:name="Medium Shading 2 Accent 6" w:uiPriority="64"/>
+    <w:lsdException w:name="Medium List 1 Accent 6" w:uiPriority="65"/>
+    <w:lsdException w:name="Medium List 2 Accent 6" w:uiPriority="66"/>
+    <w:lsdException w:name="Medium Grid 1 Accent 6" w:uiPriority="67"/>
+    <w:lsdException w:name="Medium Grid 2 Accent 6" w:uiPriority="68"/>
+    <w:lsdException w:name="Medium Grid 3 Accent 6" w:uiPriority="69"/>
+    <w:lsdException w:name="Dark List Accent 6" w:uiPriority="70"/>
+    <w:lsdException w:name="Colorful Shading Accent 6" w:uiPriority="71"/>
+    <w:lsdException w:name="Colorful List Accent 6" w:uiPriority="72"/>
+    <w:lsdException w:name="Colorful Grid Accent 6" w:uiPriority="73"/>
+    <w:lsdException w:name="Subtle Emphasis" w:uiPriority="19" w:qFormat="1"/>
+    <w:lsdException w:name="Intense Emphasis" w:uiPriority="21" w:qFormat="1"/>
+    <w:lsdException w:name="Subtle Reference" w:uiPriority="31" w:qFormat="1"/>
+    <w:lsdException w:name="Intense Reference" w:uiPriority="32" w:qFormat="1"/>
+    <w:lsdException w:name="Book Title" w:uiPriority="33" w:qFormat="1"/>
+    <w:lsdException w:name="Bibliography" w:semiHidden="1" w:uiPriority="37" w:unhideWhenUsed="1"/>
+    <w:lsdException w:name="TOC Heading" w:semiHidden="1" w:uiPriority="39" w:unhideWhenUsed="1" w:qFormat="1"/>
+    <w:lsdException w:name="Plain Table 1" w:uiPriority="41"/>
+    <w:lsdException w:name="Plain Table 2" w:uiPriority="42"/>
+    <w:lsdException w:name="Plain Table 3" w:uiPriority="43"/>
+    <w:lsdException w:name="Plain Table 4" w:uiPriority="44"/>
+    <w:lsdException w:name="Plain Table 5" w:uiPriority="45"/>
+    <w:lsdException w:name="Grid Table Light" w:uiPriority="40"/>
+    <w:lsdException w:name="Grid Table 1 Light" w:uiPriority="46"/>
+    <w:lsdException w:name="Grid Table 2" w:uiPriority="47"/>
+    <w:lsdException w:name="Grid Table 3" w:uiPriority="48"/>
+    <w:lsdException w:name="Grid Table 4" w:uiPriority="49"/>
+    <w:lsdException w:name="Grid Table 5 Dark" w:uiPriority="50"/>
+    <w:lsdException w:name="Grid Table 6 Colorful" w:uiPriority="51"/>
+    <w:lsdException w:name="Grid Table 7 Colorful" w:uiPriority="52"/>
+    <w:lsdException w:name="Grid Table 1 Light Accent 1" w:uiPriority="46"/>
+    <w:lsdException w:name="Grid Table 2 Accent 1" w:uiPriority="47"/>
+    <w:lsdException w:name="Grid Table 3 Accent 1" w:uiPriority="48"/>
+    <w:lsdException w:name="Grid Table 4 Accent 1" w:uiPriority="49"/>
+    <w:lsdException w:name="Grid Table 5 Dark Accent 1" w:uiPriority="50"/>
+    <w:lsdException w:name="Grid Table 6 Colorful Accent 1" w:uiPriority="51"/>
+    <w:lsdException w:name="Grid Table 7 Colorful Accent 1" w:uiPriority="52"/>
+    <w:lsdException w:name="Grid Table 1 Light Accent 2" w:uiPriority="46"/>
+    <w:lsdException w:name="Grid Table 2 Accent 2" w:uiPriority="47"/>
+    <w:lsdException w:name="Grid Table 3 Accent 2" w:uiPriority="48"/>
+    <w:lsdException w:name="Grid Table 4 Accent 2" w:uiPriority="49"/>
+    <w:lsdException w:name="Grid Table 5 Dark Accent 2" w:uiPriority="50"/>
+    <w:lsdException w:name="Grid Table 6 Colorful Accent 2" w:uiPriority="51"/>
+    <w:lsdException w:name="Grid Table 7 Colorful Accent 2" w:uiPriority="52"/>
+    <w:lsdException w:name="Grid Table 1 Light Accent 3" w:uiPriority="46"/>
+    <w:lsdException w:name="Grid Table 2 Accent 3" w:uiPriority="47"/>
+    <w:lsdException w:name="Grid Table 3 Accent 3" w:uiPriority="48"/>
+    <w:lsdException w:name="Grid Table 4 Accent 3" w:uiPriority="49"/>
+    <w:lsdException w:name="Grid Table 5 Dark Accent 3" w:uiPriority="50"/>
+    <w:lsdException w:name="Grid Table 6 Colorful Accent 3" w:uiPriority="51"/>
+    <w:lsdException w:name="Grid Table 7 Colorful Accent 3" w:uiPriority="52"/>
+    <w:lsdException w:name="Grid Table 1 Light Accent 4" w:uiPriority="46"/>
+    <w:lsdException w:name="Grid Table 2 Accent 4" w:uiPriority="47"/>
+    <w:lsdException w:name="Grid Table 3 Accent 4" w:uiPriority="48"/>
+    <w:lsdException w:name="Grid Table 4 Accent 4" w:uiPriority="49"/>
+    <w:lsdException w:name="Grid Table 5 Dark Accent 4" w:uiPriority="50"/>
+    <w:lsdException w:name="Grid Table 6 Colorful Accent 4" w:uiPriority="51"/>
+    <w:lsdException w:name="Grid Table 7 Colorful Accent 4" w:uiPriority="52"/>
+    <w:lsdException w:name="Grid Table 1 Light Accent 5" w:uiPriority="46"/>
+    <w:lsdException w:name="Grid Table 2 Accent 5" w:uiPriority="47"/>
+    <w:lsdException w:name="Grid Table 3 Accent 5" w:uiPriority="48"/>
+    <w:lsdException w:name="Grid Table 4 Accent 5" w:uiPriority="49"/>
+    <w:lsdException w:name="Grid Table 5 Dark Accent 5" w:uiPriority="50"/>
+    <w:lsdException w:name="Grid Table 6 Colorful Accent 5" w:uiPriority="51"/>
+    <w:lsdException w:name="Grid Table 7 Colorful Accent 5" w:uiPriority="52"/>
+    <w:lsdException w:name="Grid Table 1 Light Accent 6" w:uiPriority="46"/>
+    <w:lsdException w:name="Grid Table 2 Accent 6" w:uiPriority="47"/>
+    <w:lsdException w:name="Grid Table 3 Accent 6" w:uiPriority="48"/>
+    <w:lsdException w:name="Grid Table 4 Accent 6" w:uiPriority="49"/>
+    <w:lsdException w:name="Grid Table 5 Dark Accent 6" w:uiPriority="50"/>
+    <w:lsdException w:name="Grid Table 6 Colorful Accent 6" w:uiPriority="51"/>
+    <w:lsdException w:name="Grid Table 7 Colorful Accent 6" w:uiPriority="52"/>
+    <w:lsdException w:name="List Table 1 Light" w:uiPriority="46"/>
+    <w:lsdException w:name="List Table 2" w:uiPriority="47"/>
+    <w:lsdException w:name="List Table 3" w:uiPriority="48"/>
+    <w:lsdException w:name="List Table 4" w:uiPriority="49"/>
+    <w:lsdException w:name="List Table 5 Dark" w:uiPriority="50"/>
+    <w:lsdException w:name="List Table 6 Colorful" w:uiPriority="51"/>
+    <w:lsdException w:name="List Table 7 Colorful" w:uiPriority="52"/>
+    <w:lsdException w:name="List Table 1 Light Accent 1" w:uiPriority="46"/>
+    <w:lsdException w:name="List Table 2 Accent 1" w:uiPriority="47"/>
+    <w:lsdException w:name="List Table 3 Accent 1" w:uiPriority="48"/>
+    <w:lsdException w:name="List Table 4 Accent 1" w:uiPriority="49"/>
+    <w:lsdException w:name="List Table 5 Dark Accent 1" w:uiPriority="50"/>
+    <w:lsdException w:name="List Table 6 Colorful Accent 1" w:uiPriority="51"/>
+    <w:lsdException w:name="List Table 7 Colorful Accent 1" w:uiPriority="52"/>
+    <w:lsdException w:name="List Table 1 Light Accent 2" w:uiPriority="46"/>
+    <w:lsdException w:name="List Table 2 Accent 2" w:uiPriority="47"/>
+    <w:lsdException w:name="List Table 3 Accent 2" w:uiPriority="48"/>
+    <w:lsdException w:name="List Table 4 Accent 2" w:uiPriority="49"/>
+    <w:lsdException w:name="List Table 5 Dark Accent 2" w:uiPriority="50"/>
+    <w:lsdException w:name="List Table 6 Colorful Accent 2" w:uiPriority="51"/>
+    <w:lsdException w:name="List Table 7 Colorful Accent 2" w:uiPriority="52"/>
+    <w:lsdException w:name="List Table 1 Light Accent 3" w:uiPriority="46"/>
+    <w:lsdException w:name="List Table 2 Accent 3" w:uiPriority="47"/>
+    <w:lsdException w:name="List Table 3 Accent 3" w:uiPriority="48"/>
+    <w:lsdException w:name="List Table 4 Accent 3" w:uiPriority="49"/>
+    <w:lsdException w:name="List Table 5 Dark Accent 3" w:uiPriority="50"/>
+    <w:lsdException w:name="List Table 6 Colorful Accent 3" w:uiPriority="51"/>
+    <w:lsdException w:name="List Table 7 Colorful Accent 3" w:uiPriority="52"/>
+    <w:lsdException w:name="List Table 1 Light Accent 4" w:uiPriority="46"/>
+    <w:lsdException w:name="List Table 2 Accent 4" w:uiPriority="47"/>
+    <w:lsdException w:name="List Table 3 Accent 4" w:uiPriority="48"/>
+    <w:lsdException w:name="List Table 4 Accent 4" w:uiPriority="49"/>
+    <w:lsdException w:name="List Table 5 Dark Accent 4" w:uiPriority="50"/>
+    <w:lsdException w:name="List Table 6 Colorful Accent 4" w:uiPriority="51"/>
+    <w:lsdException w:name="List Table 7 Colorful Accent 4" w:uiPriority="52"/>
+    <w:lsdException w:name="List Table 1 Light Accent 5" w:uiPriority="46"/>
+    <w:lsdException w:name="List Table 2 Accent 5" w:uiPriority="47"/>
+    <w:lsdException w:name="List Table 3 Accent 5" w:uiPriority="48"/>
+    <w:lsdException w:name="List Table 4 Accent 5" w:uiPriority="49"/>
+    <w:lsdException w:name="List Table 5 Dark Accent 5" w:uiPriority="50"/>
+    <w:lsdException w:name="List Table 6 Colorful Accent 5" w:uiPriority="51"/>
+    <w:lsdException w:name="List Table 7 Colorful Accent 5" w:uiPriority="52"/>
+    <w:lsdException w:name="List Table 1 Light Accent 6" w:uiPriority="46"/>
+    <w:lsdException w:name="List Table 2 Accent 6" w:uiPriority="47"/>
+    <w:lsdException w:name="List Table 3 Accent 6" w:uiPriority="48"/>
+    <w:lsdException w:name="List Table 4 Accent 6" w:uiPriority="49"/>
+    <w:lsdException w:name="List Table 5 Dark Accent 6" w:uiPriority="50"/>
+    <w:lsdException w:name="List Table 6 Colorful Accent 6" w:uiPriority="51"/>
+    <w:lsdException w:name="List Table 7 Colorful Accent 6" w:uiPriority="52"/>
+    <w:lsdException w:name="Mention" w:semiHidden="1" w:unhideWhenUsed="1"/>
+    <w:lsdException w:name="Smart Hyperlink" w:semiHidden="1" w:unhideWhenUsed="1"/>
+    <w:lsdException w:name="Hashtag" w:semiHidden="1" w:unhideWhenUsed="1"/>
+    <w:lsdException w:name="Unresolved Mention" w:semiHidden="1" w:unhideWhenUsed="1"/>
+    <w:lsdException w:name="Smart Link" w:semiHidden="1" w:unhideWhenUsed="1"/>
   </w:latentStyles>
   <w:style w:type="paragraph" w:default="1" w:styleId="a">
     <w:name w:val="Normal"/>
@@ -36403,7 +36684,6 @@
     <w:uiPriority w:val="99"/>
     <w:semiHidden/>
     <w:unhideWhenUsed/>
-    <w:qFormat/>
     <w:tblPr>
       <w:tblInd w:w="0" w:type="dxa"/>
       <w:tblCellMar>
@@ -36482,7 +36762,6 @@
     <w:uiPriority w:val="59"/>
     <w:rsid w:val="007C4F90"/>
     <w:tblPr>
-      <w:tblInd w:w="0" w:type="dxa"/>
       <w:tblBorders>
         <w:top w:val="single" w:sz="4" w:space="0" w:color="auto"/>
         <w:left w:val="single" w:sz="4" w:space="0" w:color="auto"/>
@@ -36491,12 +36770,6 @@
         <w:insideH w:val="single" w:sz="4" w:space="0" w:color="auto"/>
         <w:insideV w:val="single" w:sz="4" w:space="0" w:color="auto"/>
       </w:tblBorders>
-      <w:tblCellMar>
-        <w:top w:w="0" w:type="dxa"/>
-        <w:left w:w="108" w:type="dxa"/>
-        <w:bottom w:w="0" w:type="dxa"/>
-        <w:right w:w="108" w:type="dxa"/>
-      </w:tblCellMar>
     </w:tblPr>
   </w:style>
   <w:style w:type="character" w:customStyle="1" w:styleId="a5">

</xml_diff>